<commit_message>
docs: remove RF12 e inclui RF14 nos requisitos, matriz e user stories
RF12 (exclusão de histórico de pedidos) contradizia RN04/RN05 (sem
identificador persistente de cliente) — removido por minimização de
dados por desenho (issue #53). RF14 formaliza o registro híbrido
(lista fechada + campo livre) de restrição/preferência alimentar
pelo garçom (issue #7). User Stories renumeradas (Foco US01-06,
Adicional US07-11, Extra US12-13).

Refs #7, #53
</commit_message>
<xml_diff>
--- a/docs/requisitos/GASTRA_User_Stories.docx
+++ b/docs/requisitos/GASTRA_User_Stories.docx
@@ -4,29 +4,117 @@
   <w:body>
     <w:p>
       <w:pPr>
-        <w:spacing w:after="80"/>
+        <w:spacing w:after="120" w:before="800"/>
+        <w:jc w:val="center"/>
       </w:pPr>
       <w:r>
         <w:rPr>
           <w:b/>
           <w:bCs/>
+          <w:color w:val="1F3864"/>
+          <w:sz w:val="56"/>
+          <w:szCs w:val="56"/>
+        </w:rPr>
+        <w:t xml:space="preserve">GASTRA</w:t>
+      </w:r>
+    </w:p>
+    <w:p>
+      <w:pPr>
+        <w:spacing w:after="60"/>
+        <w:jc w:val="center"/>
+      </w:pPr>
+      <w:r>
+        <w:rPr>
+          <w:b/>
+          <w:bCs/>
+          <w:color w:val="3B6E8F"/>
           <w:sz w:val="32"/>
           <w:szCs w:val="32"/>
         </w:rPr>
-        <w:t xml:space="preserve">GASTRA — User Stories</w:t>
-      </w:r>
-    </w:p>
-    <w:p>
-      <w:pPr>
-        <w:spacing w:after="160"/>
+        <w:t xml:space="preserve">User Stories</w:t>
+      </w:r>
+    </w:p>
+    <w:p>
+      <w:pPr>
+        <w:spacing w:after="600"/>
+        <w:jc w:val="center"/>
       </w:pPr>
       <w:r>
         <w:rPr>
           <w:i/>
           <w:iCs/>
-          <w:color w:val="555555"/>
+          <w:color w:val="595959"/>
+          <w:sz w:val="22"/>
+          <w:szCs w:val="22"/>
         </w:rPr>
-        <w:t xml:space="preserve">Derivadas dos Requisitos Funcionais (RF01–RF13) já formalizados em GASTRA_Requisitos_RN.docx</w:t>
+        <w:t xml:space="preserve">Derivadas dos Requisitos Funcionais (RF01–RF14) formalizados em GASTRA_Requisitos_RN.docx</w:t>
+      </w:r>
+    </w:p>
+    <w:p>
+      <w:pPr>
+        <w:spacing w:after="40"/>
+        <w:jc w:val="center"/>
+      </w:pPr>
+      <w:r>
+        <w:rPr>
+          <w:sz w:val="22"/>
+          <w:szCs w:val="22"/>
+        </w:rPr>
+        <w:t xml:space="preserve">TG — FATEC Araraquara</w:t>
+      </w:r>
+    </w:p>
+    <w:p>
+      <w:pPr>
+        <w:spacing w:after="40"/>
+        <w:jc w:val="center"/>
+      </w:pPr>
+      <w:r>
+        <w:rPr>
+          <w:sz w:val="22"/>
+          <w:szCs w:val="22"/>
+        </w:rPr>
+        <w:t xml:space="preserve">Autores: Daniel Velluto Bento e Pedro Luis Otrente de Campos</w:t>
+      </w:r>
+    </w:p>
+    <w:p>
+      <w:pPr>
+        <w:spacing w:after="40"/>
+        <w:jc w:val="center"/>
+      </w:pPr>
+      <w:r>
+        <w:rPr>
+          <w:sz w:val="22"/>
+          <w:szCs w:val="22"/>
+        </w:rPr>
+        <w:t xml:space="preserve">Orientador: Prof. Me. Leonardo José de Lima Ferrucci</w:t>
+      </w:r>
+    </w:p>
+    <w:p>
+      <w:pPr>
+        <w:spacing w:after="900"/>
+        <w:jc w:val="center"/>
+      </w:pPr>
+      <w:r>
+        <w:rPr>
+          <w:color w:val="595959"/>
+          <w:sz w:val="20"/>
+          <w:szCs w:val="20"/>
+        </w:rPr>
+        <w:t xml:space="preserve">Versão: 23/08/2026</w:t>
+      </w:r>
+    </w:p>
+    <w:p>
+      <w:r>
+        <w:br w:type="page"/>
+      </w:r>
+    </w:p>
+    <w:p>
+      <w:pPr>
+        <w:pStyle w:val="Heading1"/>
+        <w:spacing w:after="160" w:before="320"/>
+      </w:pPr>
+      <w:r>
+        <w:t xml:space="preserve">1. Sobre este documento</w:t>
       </w:r>
     </w:p>
     <w:p>
@@ -34,67 +122,42 @@
         <w:spacing w:after="160"/>
       </w:pPr>
       <w:r>
-        <w:t xml:space="preserve">TG — FATEC Araraquara | Autores: Daniel (Danih) e Pedro | Orientador: Prof. Me. Leonardo José de Lima Ferrucci</w:t>
-      </w:r>
-    </w:p>
-    <w:p>
-      <w:pPr>
-        <w:spacing w:after="160"/>
+        <w:t xml:space="preserve">Cada User Story usa o formato "Como [ator], quero [ação], para [benefício]" e referencia o RF de origem, para manter rastreabilidade com o Requisitos_RN.docx e a Matriz de Rastreabilidade. As stories estão organizadas em três grupos de prioridade, que refletem o status de escopo vigente — a ordem de implementação deve seguir essa hierarquia, não a ordem de leitura dos RF.</w:t>
+      </w:r>
+    </w:p>
+    <w:p>
+      <w:pPr>
+        <w:spacing w:after="200"/>
       </w:pPr>
       <w:r>
         <w:rPr>
           <w:i/>
           <w:iCs/>
+          <w:color w:val="595959"/>
+          <w:sz w:val="20"/>
+          <w:szCs w:val="20"/>
         </w:rPr>
-        <w:t xml:space="preserve">Versão: 21/08/2026</w:t>
-      </w:r>
-    </w:p>
-    <w:p>
-      <w:pPr>
-        <w:pStyle w:val="Heading1"/>
-        <w:spacing w:after="160" w:before="320"/>
-      </w:pPr>
-      <w:r>
-        <w:t xml:space="preserve">1. Sobre este documento</w:t>
-      </w:r>
-    </w:p>
-    <w:p>
-      <w:pPr>
-        <w:spacing w:after="160"/>
-      </w:pPr>
-      <w:r>
-        <w:t xml:space="preserve">Cada User Story usa o formato "Como [ator], quero [ação], para [benefício]" e referencia o RF de origem, para manter rastreabilidade com o Requisitos_RN.docx e a Matriz de Rastreabilidade. As stories estão organizadas em três grupos de prioridade, que refletem o status de escopo vigente (ver GASTRA_STATUS.md, seção 1) — isso é proposital: a ordem de implementação deve seguir essa hierarquia, não a ordem de leitura mais "natural" dos RF.</w:t>
-      </w:r>
-    </w:p>
-    <w:p>
-      <w:pPr>
-        <w:pBdr>
-          <w:left w:val="single" w:color="999999" w:sz="12" w:space="8"/>
-        </w:pBdr>
-        <w:spacing w:after="200" w:before="120"/>
-        <w:ind w:left="200"/>
+        <w:t xml:space="preserve">Atualização de 23/08/2026: a antiga US07 (ligada a RF12, exclusão de histórico) foi removida — RF12 saiu do escopo (issue #53). A numeração das demais stories da seção Foco foi fechada em 6 (US01–US06); a seção Adicional ganhou uma nova story (US11, ligada a RF14, issue #7); a seção Extra manteve a numeração (US12–US13).</w:t>
+      </w:r>
+    </w:p>
+    <w:p>
+      <w:pPr>
+        <w:spacing w:after="140" w:before="280"/>
       </w:pPr>
       <w:r>
         <w:rPr>
-          <w:i/>
-          <w:iCs/>
-          <w:color w:val="555555"/>
+          <w:b/>
+          <w:bCs/>
+          <w:color w:val="3B6E8F"/>
+          <w:sz w:val="26"/>
+          <w:szCs w:val="26"/>
         </w:rPr>
-        <w:t xml:space="preserve">Convenção de prioridade: 🟢 Foco — os 4 blocos analíticos, entrega central do TG. 🟢 Adicional — núcleo de comandas, necessário mas não é o foco. 🟠 Extra — condicionado a sobrar tempo, não é compromisso de entrega.</w:t>
-      </w:r>
-    </w:p>
-    <w:p>
-      <w:pPr>
-        <w:pStyle w:val="Heading1"/>
-        <w:spacing w:after="160" w:before="320"/>
-      </w:pPr>
-      <w:r>
-        <w:t xml:space="preserve">2. 🟢 Foco — Blocos analíticos (BI, Ciência de Dados, PL, LGPD)</w:t>
+        <w:t xml:space="preserve">2. Foco — Blocos analíticos (BI, Ciência de Dados, PL, LGPD)</w:t>
       </w:r>
     </w:p>
     <w:tbl>
       <w:tblPr>
-        <w:tblW w:type="dxa" w:w="9360"/>
+        <w:tblW w:type="dxa" w:w="9500"/>
         <w:tblBorders>
           <w:top w:val="single" w:color="auto" w:sz="4"/>
           <w:left w:val="single" w:color="auto" w:sz="4"/>
@@ -106,8 +169,8 @@
       </w:tblPr>
       <w:tblGrid>
         <w:gridCol w:w="900"/>
-        <w:gridCol w:w="6960"/>
-        <w:gridCol w:w="1500"/>
+        <w:gridCol w:w="6900"/>
+        <w:gridCol w:w="1700"/>
       </w:tblGrid>
       <w:tr>
         <w:trPr>
@@ -116,7 +179,8 @@
         <w:tc>
           <w:tcPr>
             <w:tcW w:type="dxa" w:w="900"/>
-            <w:shd w:fill="2F5233" w:val="clear"/>
+            <w:shd w:fill="1F3864" w:val="clear"/>
+            <w:vAlign w:val="center"/>
           </w:tcPr>
           <w:p>
             <w:r>
@@ -124,8 +188,8 @@
                 <w:b/>
                 <w:bCs/>
                 <w:color w:val="FFFFFF"/>
-                <w:sz w:val="18"/>
-                <w:szCs w:val="18"/>
+                <w:sz w:val="19"/>
+                <w:szCs w:val="19"/>
               </w:rPr>
               <w:t xml:space="preserve">ID</w:t>
             </w:r>
@@ -133,8 +197,9 @@
         </w:tc>
         <w:tc>
           <w:tcPr>
-            <w:tcW w:type="dxa" w:w="6960"/>
-            <w:shd w:fill="2F5233" w:val="clear"/>
+            <w:tcW w:type="dxa" w:w="6900"/>
+            <w:shd w:fill="1F3864" w:val="clear"/>
+            <w:vAlign w:val="center"/>
           </w:tcPr>
           <w:p>
             <w:r>
@@ -142,8 +207,8 @@
                 <w:b/>
                 <w:bCs/>
                 <w:color w:val="FFFFFF"/>
-                <w:sz w:val="18"/>
-                <w:szCs w:val="18"/>
+                <w:sz w:val="19"/>
+                <w:szCs w:val="19"/>
               </w:rPr>
               <w:t xml:space="preserve">User Story</w:t>
             </w:r>
@@ -151,8 +216,9 @@
         </w:tc>
         <w:tc>
           <w:tcPr>
-            <w:tcW w:type="dxa" w:w="1500"/>
-            <w:shd w:fill="2F5233" w:val="clear"/>
+            <w:tcW w:type="dxa" w:w="1700"/>
+            <w:shd w:fill="1F3864" w:val="clear"/>
+            <w:vAlign w:val="center"/>
           </w:tcPr>
           <w:p>
             <w:r>
@@ -160,8 +226,8 @@
                 <w:b/>
                 <w:bCs/>
                 <w:color w:val="FFFFFF"/>
-                <w:sz w:val="18"/>
-                <w:szCs w:val="18"/>
+                <w:sz w:val="19"/>
+                <w:szCs w:val="19"/>
               </w:rPr>
               <w:t xml:space="preserve">RF de origem</w:t>
             </w:r>
@@ -172,12 +238,13 @@
         <w:tc>
           <w:tcPr>
             <w:tcW w:type="dxa" w:w="900"/>
-          </w:tcPr>
-          <w:p>
-            <w:r>
-              <w:rPr>
-                <w:sz w:val="18"/>
-                <w:szCs w:val="18"/>
+            <w:vAlign w:val="center"/>
+          </w:tcPr>
+          <w:p>
+            <w:r>
+              <w:rPr>
+                <w:sz w:val="19"/>
+                <w:szCs w:val="19"/>
               </w:rPr>
               <w:t xml:space="preserve">US01</w:t>
             </w:r>
@@ -185,27 +252,29 @@
         </w:tc>
         <w:tc>
           <w:tcPr>
-            <w:tcW w:type="dxa" w:w="6960"/>
-          </w:tcPr>
-          <w:p>
-            <w:r>
-              <w:rPr>
-                <w:sz w:val="18"/>
-                <w:szCs w:val="18"/>
-              </w:rPr>
-              <w:t xml:space="preserve">Como Metre, quero receber uma sugestão automática de alocação de garçons às praças, para reduzir a percepção de injustiça na distribuição hoje baseada em hierarquia informal ("chefe de fila escolhe primeiro").</w:t>
-            </w:r>
-          </w:p>
-        </w:tc>
-        <w:tc>
-          <w:tcPr>
-            <w:tcW w:type="dxa" w:w="1500"/>
-          </w:tcPr>
-          <w:p>
-            <w:r>
-              <w:rPr>
-                <w:sz w:val="18"/>
-                <w:szCs w:val="18"/>
+            <w:tcW w:type="dxa" w:w="6900"/>
+            <w:vAlign w:val="center"/>
+          </w:tcPr>
+          <w:p>
+            <w:r>
+              <w:rPr>
+                <w:sz w:val="19"/>
+                <w:szCs w:val="19"/>
+              </w:rPr>
+              <w:t xml:space="preserve">Como Metre, quero receber uma sugestão automática de alocação de garçons às praças, para reduzir a percepção de injustiça na distribuição hoje baseada em hierarquia informal.</w:t>
+            </w:r>
+          </w:p>
+        </w:tc>
+        <w:tc>
+          <w:tcPr>
+            <w:tcW w:type="dxa" w:w="1700"/>
+            <w:vAlign w:val="center"/>
+          </w:tcPr>
+          <w:p>
+            <w:r>
+              <w:rPr>
+                <w:sz w:val="19"/>
+                <w:szCs w:val="19"/>
               </w:rPr>
               <w:t xml:space="preserve">RF06</w:t>
             </w:r>
@@ -216,12 +285,13 @@
         <w:tc>
           <w:tcPr>
             <w:tcW w:type="dxa" w:w="900"/>
-          </w:tcPr>
-          <w:p>
-            <w:r>
-              <w:rPr>
-                <w:sz w:val="18"/>
-                <w:szCs w:val="18"/>
+            <w:vAlign w:val="center"/>
+          </w:tcPr>
+          <w:p>
+            <w:r>
+              <w:rPr>
+                <w:sz w:val="19"/>
+                <w:szCs w:val="19"/>
               </w:rPr>
               <w:t xml:space="preserve">US02</w:t>
             </w:r>
@@ -229,27 +299,29 @@
         </w:tc>
         <w:tc>
           <w:tcPr>
-            <w:tcW w:type="dxa" w:w="6960"/>
-          </w:tcPr>
-          <w:p>
-            <w:r>
-              <w:rPr>
-                <w:sz w:val="18"/>
-                <w:szCs w:val="18"/>
-              </w:rPr>
-              <w:t xml:space="preserve">Como Metre, quero poder visualizar e ajustar manualmente a alocação sugerida antes de confirmá-la, para manter a decisão final sob meu controle em casos que o sistema não capta.</w:t>
-            </w:r>
-          </w:p>
-        </w:tc>
-        <w:tc>
-          <w:tcPr>
-            <w:tcW w:type="dxa" w:w="1500"/>
-          </w:tcPr>
-          <w:p>
-            <w:r>
-              <w:rPr>
-                <w:sz w:val="18"/>
-                <w:szCs w:val="18"/>
+            <w:tcW w:type="dxa" w:w="6900"/>
+            <w:vAlign w:val="center"/>
+          </w:tcPr>
+          <w:p>
+            <w:r>
+              <w:rPr>
+                <w:sz w:val="19"/>
+                <w:szCs w:val="19"/>
+              </w:rPr>
+              <w:t xml:space="preserve">Como Metre, quero poder visualizar e ajustar manualmente a alocação sugerida antes de confirmá-la, para manter a decisão final sob meu controle.</w:t>
+            </w:r>
+          </w:p>
+        </w:tc>
+        <w:tc>
+          <w:tcPr>
+            <w:tcW w:type="dxa" w:w="1700"/>
+            <w:vAlign w:val="center"/>
+          </w:tcPr>
+          <w:p>
+            <w:r>
+              <w:rPr>
+                <w:sz w:val="19"/>
+                <w:szCs w:val="19"/>
               </w:rPr>
               <w:t xml:space="preserve">RF07</w:t>
             </w:r>
@@ -260,12 +332,13 @@
         <w:tc>
           <w:tcPr>
             <w:tcW w:type="dxa" w:w="900"/>
-          </w:tcPr>
-          <w:p>
-            <w:r>
-              <w:rPr>
-                <w:sz w:val="18"/>
-                <w:szCs w:val="18"/>
+            <w:vAlign w:val="center"/>
+          </w:tcPr>
+          <w:p>
+            <w:r>
+              <w:rPr>
+                <w:sz w:val="19"/>
+                <w:szCs w:val="19"/>
               </w:rPr>
               <w:t xml:space="preserve">US03</w:t>
             </w:r>
@@ -273,27 +346,29 @@
         </w:tc>
         <w:tc>
           <w:tcPr>
-            <w:tcW w:type="dxa" w:w="6960"/>
-          </w:tcPr>
-          <w:p>
-            <w:r>
-              <w:rPr>
-                <w:sz w:val="18"/>
-                <w:szCs w:val="18"/>
-              </w:rPr>
-              <w:t xml:space="preserve">Como Gerente, quero que o sistema registre o histórico de faturamento por praça e por garçom, para que a alocação futura (RN03) seja baseada em dado real, não em percepção.</w:t>
-            </w:r>
-          </w:p>
-        </w:tc>
-        <w:tc>
-          <w:tcPr>
-            <w:tcW w:type="dxa" w:w="1500"/>
-          </w:tcPr>
-          <w:p>
-            <w:r>
-              <w:rPr>
-                <w:sz w:val="18"/>
-                <w:szCs w:val="18"/>
+            <w:tcW w:type="dxa" w:w="6900"/>
+            <w:vAlign w:val="center"/>
+          </w:tcPr>
+          <w:p>
+            <w:r>
+              <w:rPr>
+                <w:sz w:val="19"/>
+                <w:szCs w:val="19"/>
+              </w:rPr>
+              <w:t xml:space="preserve">Como Gerente, quero que o sistema registre o histórico de faturamento por praça e por garçom, para que a alocação futura (RN03) seja baseada em dado real.</w:t>
+            </w:r>
+          </w:p>
+        </w:tc>
+        <w:tc>
+          <w:tcPr>
+            <w:tcW w:type="dxa" w:w="1700"/>
+            <w:vAlign w:val="center"/>
+          </w:tcPr>
+          <w:p>
+            <w:r>
+              <w:rPr>
+                <w:sz w:val="19"/>
+                <w:szCs w:val="19"/>
               </w:rPr>
               <w:t xml:space="preserve">RF08</w:t>
             </w:r>
@@ -304,12 +379,13 @@
         <w:tc>
           <w:tcPr>
             <w:tcW w:type="dxa" w:w="900"/>
-          </w:tcPr>
-          <w:p>
-            <w:r>
-              <w:rPr>
-                <w:sz w:val="18"/>
-                <w:szCs w:val="18"/>
+            <w:vAlign w:val="center"/>
+          </w:tcPr>
+          <w:p>
+            <w:r>
+              <w:rPr>
+                <w:sz w:val="19"/>
+                <w:szCs w:val="19"/>
               </w:rPr>
               <w:t xml:space="preserve">US04</w:t>
             </w:r>
@@ -317,27 +393,29 @@
         </w:tc>
         <w:tc>
           <w:tcPr>
-            <w:tcW w:type="dxa" w:w="6960"/>
-          </w:tcPr>
-          <w:p>
-            <w:r>
-              <w:rPr>
-                <w:sz w:val="18"/>
-                <w:szCs w:val="18"/>
-              </w:rPr>
-              <w:t xml:space="preserve">Como Garçom, quero receber sugestões de combinação de pratos baseadas em padrão de consumo, para não depender só de "se o cliente já frequenta a casa" como critério de recomendação.</w:t>
-            </w:r>
-          </w:p>
-        </w:tc>
-        <w:tc>
-          <w:tcPr>
-            <w:tcW w:type="dxa" w:w="1500"/>
-          </w:tcPr>
-          <w:p>
-            <w:r>
-              <w:rPr>
-                <w:sz w:val="18"/>
-                <w:szCs w:val="18"/>
+            <w:tcW w:type="dxa" w:w="6900"/>
+            <w:vAlign w:val="center"/>
+          </w:tcPr>
+          <w:p>
+            <w:r>
+              <w:rPr>
+                <w:sz w:val="19"/>
+                <w:szCs w:val="19"/>
+              </w:rPr>
+              <w:t xml:space="preserve">Como Garçom, quero receber sugestões de combinação de pratos baseadas em padrão de consumo, para não depender só de "se o cliente já frequenta a casa".</w:t>
+            </w:r>
+          </w:p>
+        </w:tc>
+        <w:tc>
+          <w:tcPr>
+            <w:tcW w:type="dxa" w:w="1700"/>
+            <w:vAlign w:val="center"/>
+          </w:tcPr>
+          <w:p>
+            <w:r>
+              <w:rPr>
+                <w:sz w:val="19"/>
+                <w:szCs w:val="19"/>
               </w:rPr>
               <w:t xml:space="preserve">RF09</w:t>
             </w:r>
@@ -348,12 +426,13 @@
         <w:tc>
           <w:tcPr>
             <w:tcW w:type="dxa" w:w="900"/>
-          </w:tcPr>
-          <w:p>
-            <w:r>
-              <w:rPr>
-                <w:sz w:val="18"/>
-                <w:szCs w:val="18"/>
+            <w:vAlign w:val="center"/>
+          </w:tcPr>
+          <w:p>
+            <w:r>
+              <w:rPr>
+                <w:sz w:val="19"/>
+                <w:szCs w:val="19"/>
               </w:rPr>
               <w:t xml:space="preserve">US05</w:t>
             </w:r>
@@ -361,27 +440,29 @@
         </w:tc>
         <w:tc>
           <w:tcPr>
-            <w:tcW w:type="dxa" w:w="6960"/>
-          </w:tcPr>
-          <w:p>
-            <w:r>
-              <w:rPr>
-                <w:sz w:val="18"/>
-                <w:szCs w:val="18"/>
-              </w:rPr>
-              <w:t xml:space="preserve">Como Gerente, quero visualizar relatórios agregados de faturamento por praça e por garçom com os KPIs definidos, para tomar decisões operacionais baseadas em dado, não em impressão.</w:t>
-            </w:r>
-          </w:p>
-        </w:tc>
-        <w:tc>
-          <w:tcPr>
-            <w:tcW w:type="dxa" w:w="1500"/>
-          </w:tcPr>
-          <w:p>
-            <w:r>
-              <w:rPr>
-                <w:sz w:val="18"/>
-                <w:szCs w:val="18"/>
+            <w:tcW w:type="dxa" w:w="6900"/>
+            <w:vAlign w:val="center"/>
+          </w:tcPr>
+          <w:p>
+            <w:r>
+              <w:rPr>
+                <w:sz w:val="19"/>
+                <w:szCs w:val="19"/>
+              </w:rPr>
+              <w:t xml:space="preserve">Como Gerente, quero visualizar relatórios agregados de faturamento por praça e por garçom com os KPIs definidos, para tomar decisões baseadas em dado.</w:t>
+            </w:r>
+          </w:p>
+        </w:tc>
+        <w:tc>
+          <w:tcPr>
+            <w:tcW w:type="dxa" w:w="1700"/>
+            <w:vAlign w:val="center"/>
+          </w:tcPr>
+          <w:p>
+            <w:r>
+              <w:rPr>
+                <w:sz w:val="19"/>
+                <w:szCs w:val="19"/>
               </w:rPr>
               <w:t xml:space="preserve">RF10</w:t>
             </w:r>
@@ -392,12 +473,13 @@
         <w:tc>
           <w:tcPr>
             <w:tcW w:type="dxa" w:w="900"/>
-          </w:tcPr>
-          <w:p>
-            <w:r>
-              <w:rPr>
-                <w:sz w:val="18"/>
-                <w:szCs w:val="18"/>
+            <w:vAlign w:val="center"/>
+          </w:tcPr>
+          <w:p>
+            <w:r>
+              <w:rPr>
+                <w:sz w:val="19"/>
+                <w:szCs w:val="19"/>
               </w:rPr>
               <w:t xml:space="preserve">US06</w:t>
             </w:r>
@@ -405,73 +487,31 @@
         </w:tc>
         <w:tc>
           <w:tcPr>
-            <w:tcW w:type="dxa" w:w="6960"/>
-          </w:tcPr>
-          <w:p>
-            <w:r>
-              <w:rPr>
-                <w:sz w:val="18"/>
-                <w:szCs w:val="18"/>
-              </w:rPr>
-              <w:t xml:space="preserve">Como Garçom, quero visualizar um índice composto de desempenho (não só venda), para que o ranking reflita meu trabalho de forma mais justa do que uma métrica única.</w:t>
-            </w:r>
-          </w:p>
-        </w:tc>
-        <w:tc>
-          <w:tcPr>
-            <w:tcW w:type="dxa" w:w="1500"/>
-          </w:tcPr>
-          <w:p>
-            <w:r>
-              <w:rPr>
-                <w:sz w:val="18"/>
-                <w:szCs w:val="18"/>
+            <w:tcW w:type="dxa" w:w="6900"/>
+            <w:vAlign w:val="center"/>
+          </w:tcPr>
+          <w:p>
+            <w:r>
+              <w:rPr>
+                <w:sz w:val="19"/>
+                <w:szCs w:val="19"/>
+              </w:rPr>
+              <w:t xml:space="preserve">Como Garçom, quero visualizar um índice composto de desempenho (não só venda), para que o ranking reflita meu trabalho de forma mais justa.</w:t>
+            </w:r>
+          </w:p>
+        </w:tc>
+        <w:tc>
+          <w:tcPr>
+            <w:tcW w:type="dxa" w:w="1700"/>
+            <w:vAlign w:val="center"/>
+          </w:tcPr>
+          <w:p>
+            <w:r>
+              <w:rPr>
+                <w:sz w:val="19"/>
+                <w:szCs w:val="19"/>
               </w:rPr>
               <w:t xml:space="preserve">RF11</w:t>
-            </w:r>
-          </w:p>
-        </w:tc>
-      </w:tr>
-      <w:tr>
-        <w:tc>
-          <w:tcPr>
-            <w:tcW w:type="dxa" w:w="900"/>
-          </w:tcPr>
-          <w:p>
-            <w:r>
-              <w:rPr>
-                <w:sz w:val="18"/>
-                <w:szCs w:val="18"/>
-              </w:rPr>
-              <w:t xml:space="preserve">US07</w:t>
-            </w:r>
-          </w:p>
-        </w:tc>
-        <w:tc>
-          <w:tcPr>
-            <w:tcW w:type="dxa" w:w="6960"/>
-          </w:tcPr>
-          <w:p>
-            <w:r>
-              <w:rPr>
-                <w:sz w:val="18"/>
-                <w:szCs w:val="18"/>
-              </w:rPr>
-              <w:t xml:space="preserve">Como Cliente, quero poder solicitar a exclusão do meu histórico de pedidos a qualquer momento, para exercer meu direito ao esquecimento garantido pela LGPD.</w:t>
-            </w:r>
-          </w:p>
-        </w:tc>
-        <w:tc>
-          <w:tcPr>
-            <w:tcW w:type="dxa" w:w="1500"/>
-          </w:tcPr>
-          <w:p>
-            <w:r>
-              <w:rPr>
-                <w:sz w:val="18"/>
-                <w:szCs w:val="18"/>
-              </w:rPr>
-              <w:t xml:space="preserve">RF12</w:t>
             </w:r>
           </w:p>
         </w:tc>
@@ -479,11 +519,17 @@
     </w:tbl>
     <w:p>
       <w:pPr>
-        <w:pStyle w:val="Heading1"/>
-        <w:spacing w:after="160" w:before="320"/>
-      </w:pPr>
-      <w:r>
-        <w:t xml:space="preserve">3. 🟢 Adicional — Núcleo do módulo de comandas</w:t>
+        <w:spacing w:after="140" w:before="280"/>
+      </w:pPr>
+      <w:r>
+        <w:rPr>
+          <w:b/>
+          <w:bCs/>
+          <w:color w:val="38761D"/>
+          <w:sz w:val="26"/>
+          <w:szCs w:val="26"/>
+        </w:rPr>
+        <w:t xml:space="preserve">3. Adicional — Núcleo do módulo de comandas</w:t>
       </w:r>
     </w:p>
     <w:p>
@@ -496,7 +542,7 @@
     </w:p>
     <w:tbl>
       <w:tblPr>
-        <w:tblW w:type="dxa" w:w="9360"/>
+        <w:tblW w:type="dxa" w:w="9500"/>
         <w:tblBorders>
           <w:top w:val="single" w:color="auto" w:sz="4"/>
           <w:left w:val="single" w:color="auto" w:sz="4"/>
@@ -508,8 +554,8 @@
       </w:tblPr>
       <w:tblGrid>
         <w:gridCol w:w="900"/>
-        <w:gridCol w:w="6960"/>
-        <w:gridCol w:w="1500"/>
+        <w:gridCol w:w="6900"/>
+        <w:gridCol w:w="1700"/>
       </w:tblGrid>
       <w:tr>
         <w:trPr>
@@ -518,7 +564,8 @@
         <w:tc>
           <w:tcPr>
             <w:tcW w:type="dxa" w:w="900"/>
-            <w:shd w:fill="2F5233" w:val="clear"/>
+            <w:shd w:fill="38761D" w:val="clear"/>
+            <w:vAlign w:val="center"/>
           </w:tcPr>
           <w:p>
             <w:r>
@@ -526,8 +573,8 @@
                 <w:b/>
                 <w:bCs/>
                 <w:color w:val="FFFFFF"/>
-                <w:sz w:val="18"/>
-                <w:szCs w:val="18"/>
+                <w:sz w:val="19"/>
+                <w:szCs w:val="19"/>
               </w:rPr>
               <w:t xml:space="preserve">ID</w:t>
             </w:r>
@@ -535,8 +582,9 @@
         </w:tc>
         <w:tc>
           <w:tcPr>
-            <w:tcW w:type="dxa" w:w="6960"/>
-            <w:shd w:fill="2F5233" w:val="clear"/>
+            <w:tcW w:type="dxa" w:w="6900"/>
+            <w:shd w:fill="38761D" w:val="clear"/>
+            <w:vAlign w:val="center"/>
           </w:tcPr>
           <w:p>
             <w:r>
@@ -544,8 +592,8 @@
                 <w:b/>
                 <w:bCs/>
                 <w:color w:val="FFFFFF"/>
-                <w:sz w:val="18"/>
-                <w:szCs w:val="18"/>
+                <w:sz w:val="19"/>
+                <w:szCs w:val="19"/>
               </w:rPr>
               <w:t xml:space="preserve">User Story</w:t>
             </w:r>
@@ -553,8 +601,9 @@
         </w:tc>
         <w:tc>
           <w:tcPr>
-            <w:tcW w:type="dxa" w:w="1500"/>
-            <w:shd w:fill="2F5233" w:val="clear"/>
+            <w:tcW w:type="dxa" w:w="1700"/>
+            <w:shd w:fill="38761D" w:val="clear"/>
+            <w:vAlign w:val="center"/>
           </w:tcPr>
           <w:p>
             <w:r>
@@ -562,8 +611,8 @@
                 <w:b/>
                 <w:bCs/>
                 <w:color w:val="FFFFFF"/>
-                <w:sz w:val="18"/>
-                <w:szCs w:val="18"/>
+                <w:sz w:val="19"/>
+                <w:szCs w:val="19"/>
               </w:rPr>
               <w:t xml:space="preserve">RF de origem</w:t>
             </w:r>
@@ -574,26 +623,28 @@
         <w:tc>
           <w:tcPr>
             <w:tcW w:type="dxa" w:w="900"/>
-          </w:tcPr>
-          <w:p>
-            <w:r>
-              <w:rPr>
-                <w:sz w:val="18"/>
-                <w:szCs w:val="18"/>
-              </w:rPr>
-              <w:t xml:space="preserve">US08</w:t>
-            </w:r>
-          </w:p>
-        </w:tc>
-        <w:tc>
-          <w:tcPr>
-            <w:tcW w:type="dxa" w:w="6960"/>
-          </w:tcPr>
-          <w:p>
-            <w:r>
-              <w:rPr>
-                <w:sz w:val="18"/>
-                <w:szCs w:val="18"/>
+            <w:vAlign w:val="center"/>
+          </w:tcPr>
+          <w:p>
+            <w:r>
+              <w:rPr>
+                <w:sz w:val="19"/>
+                <w:szCs w:val="19"/>
+              </w:rPr>
+              <w:t xml:space="preserve">US07</w:t>
+            </w:r>
+          </w:p>
+        </w:tc>
+        <w:tc>
+          <w:tcPr>
+            <w:tcW w:type="dxa" w:w="6900"/>
+            <w:vAlign w:val="center"/>
+          </w:tcPr>
+          <w:p>
+            <w:r>
+              <w:rPr>
+                <w:sz w:val="19"/>
+                <w:szCs w:val="19"/>
               </w:rPr>
               <w:t xml:space="preserve">Como Garçom, quero abrir uma comanda vinculada a uma mesa específica, para iniciar o registro do atendimento daquela mesa.</w:t>
             </w:r>
@@ -601,13 +652,14 @@
         </w:tc>
         <w:tc>
           <w:tcPr>
-            <w:tcW w:type="dxa" w:w="1500"/>
-          </w:tcPr>
-          <w:p>
-            <w:r>
-              <w:rPr>
-                <w:sz w:val="18"/>
-                <w:szCs w:val="18"/>
+            <w:tcW w:type="dxa" w:w="1700"/>
+            <w:vAlign w:val="center"/>
+          </w:tcPr>
+          <w:p>
+            <w:r>
+              <w:rPr>
+                <w:sz w:val="19"/>
+                <w:szCs w:val="19"/>
               </w:rPr>
               <w:t xml:space="preserve">RF01</w:t>
             </w:r>
@@ -618,26 +670,28 @@
         <w:tc>
           <w:tcPr>
             <w:tcW w:type="dxa" w:w="900"/>
-          </w:tcPr>
-          <w:p>
-            <w:r>
-              <w:rPr>
-                <w:sz w:val="18"/>
-                <w:szCs w:val="18"/>
-              </w:rPr>
-              <w:t xml:space="preserve">US09</w:t>
-            </w:r>
-          </w:p>
-        </w:tc>
-        <w:tc>
-          <w:tcPr>
-            <w:tcW w:type="dxa" w:w="6960"/>
-          </w:tcPr>
-          <w:p>
-            <w:r>
-              <w:rPr>
-                <w:sz w:val="18"/>
-                <w:szCs w:val="18"/>
+            <w:vAlign w:val="center"/>
+          </w:tcPr>
+          <w:p>
+            <w:r>
+              <w:rPr>
+                <w:sz w:val="19"/>
+                <w:szCs w:val="19"/>
+              </w:rPr>
+              <w:t xml:space="preserve">US08</w:t>
+            </w:r>
+          </w:p>
+        </w:tc>
+        <w:tc>
+          <w:tcPr>
+            <w:tcW w:type="dxa" w:w="6900"/>
+            <w:vAlign w:val="center"/>
+          </w:tcPr>
+          <w:p>
+            <w:r>
+              <w:rPr>
+                <w:sz w:val="19"/>
+                <w:szCs w:val="19"/>
               </w:rPr>
               <w:t xml:space="preserve">Como Garçom, quero que o sistema sugira automaticamente a composição da mesa e eu possa confirmar ou ajustar, para não depender só da minha percepção visual em casos ambíguos.</w:t>
             </w:r>
@@ -645,13 +699,14 @@
         </w:tc>
         <w:tc>
           <w:tcPr>
-            <w:tcW w:type="dxa" w:w="1500"/>
-          </w:tcPr>
-          <w:p>
-            <w:r>
-              <w:rPr>
-                <w:sz w:val="18"/>
-                <w:szCs w:val="18"/>
+            <w:tcW w:type="dxa" w:w="1700"/>
+            <w:vAlign w:val="center"/>
+          </w:tcPr>
+          <w:p>
+            <w:r>
+              <w:rPr>
+                <w:sz w:val="19"/>
+                <w:szCs w:val="19"/>
               </w:rPr>
               <w:t xml:space="preserve">RF02</w:t>
             </w:r>
@@ -662,40 +717,43 @@
         <w:tc>
           <w:tcPr>
             <w:tcW w:type="dxa" w:w="900"/>
-          </w:tcPr>
-          <w:p>
-            <w:r>
-              <w:rPr>
-                <w:sz w:val="18"/>
-                <w:szCs w:val="18"/>
-              </w:rPr>
-              <w:t xml:space="preserve">US10</w:t>
-            </w:r>
-          </w:p>
-        </w:tc>
-        <w:tc>
-          <w:tcPr>
-            <w:tcW w:type="dxa" w:w="6960"/>
-          </w:tcPr>
-          <w:p>
-            <w:r>
-              <w:rPr>
-                <w:sz w:val="18"/>
-                <w:szCs w:val="18"/>
-              </w:rPr>
-              <w:t xml:space="preserve">Como Garçom, quero registrar os itens do pedido na comanda com uma lista de pendências visível, para não esquecer itens simples (ex.: água) que hoje se perdem na correria.</w:t>
-            </w:r>
-          </w:p>
-        </w:tc>
-        <w:tc>
-          <w:tcPr>
-            <w:tcW w:type="dxa" w:w="1500"/>
-          </w:tcPr>
-          <w:p>
-            <w:r>
-              <w:rPr>
-                <w:sz w:val="18"/>
-                <w:szCs w:val="18"/>
+            <w:vAlign w:val="center"/>
+          </w:tcPr>
+          <w:p>
+            <w:r>
+              <w:rPr>
+                <w:sz w:val="19"/>
+                <w:szCs w:val="19"/>
+              </w:rPr>
+              <w:t xml:space="preserve">US09</w:t>
+            </w:r>
+          </w:p>
+        </w:tc>
+        <w:tc>
+          <w:tcPr>
+            <w:tcW w:type="dxa" w:w="6900"/>
+            <w:vAlign w:val="center"/>
+          </w:tcPr>
+          <w:p>
+            <w:r>
+              <w:rPr>
+                <w:sz w:val="19"/>
+                <w:szCs w:val="19"/>
+              </w:rPr>
+              <w:t xml:space="preserve">Como Garçom, quero registrar os itens do pedido na comanda com uma lista de pendências visível, para não esquecer itens simples (ex.: água).</w:t>
+            </w:r>
+          </w:p>
+        </w:tc>
+        <w:tc>
+          <w:tcPr>
+            <w:tcW w:type="dxa" w:w="1700"/>
+            <w:vAlign w:val="center"/>
+          </w:tcPr>
+          <w:p>
+            <w:r>
+              <w:rPr>
+                <w:sz w:val="19"/>
+                <w:szCs w:val="19"/>
               </w:rPr>
               <w:t xml:space="preserve">RF03</w:t>
             </w:r>
@@ -706,12 +764,60 @@
         <w:tc>
           <w:tcPr>
             <w:tcW w:type="dxa" w:w="900"/>
-          </w:tcPr>
-          <w:p>
-            <w:r>
-              <w:rPr>
-                <w:sz w:val="18"/>
-                <w:szCs w:val="18"/>
+            <w:vAlign w:val="center"/>
+          </w:tcPr>
+          <w:p>
+            <w:r>
+              <w:rPr>
+                <w:sz w:val="19"/>
+                <w:szCs w:val="19"/>
+              </w:rPr>
+              <w:t xml:space="preserve">US10</w:t>
+            </w:r>
+          </w:p>
+        </w:tc>
+        <w:tc>
+          <w:tcPr>
+            <w:tcW w:type="dxa" w:w="6900"/>
+            <w:vAlign w:val="center"/>
+          </w:tcPr>
+          <w:p>
+            <w:r>
+              <w:rPr>
+                <w:sz w:val="19"/>
+                <w:szCs w:val="19"/>
+              </w:rPr>
+              <w:t xml:space="preserve">Como Garçom, quero fechar a comanda com o cálculo automático do total e da taxa de serviço, para reduzir erro manual no fechamento.</w:t>
+            </w:r>
+          </w:p>
+        </w:tc>
+        <w:tc>
+          <w:tcPr>
+            <w:tcW w:type="dxa" w:w="1700"/>
+            <w:vAlign w:val="center"/>
+          </w:tcPr>
+          <w:p>
+            <w:r>
+              <w:rPr>
+                <w:sz w:val="19"/>
+                <w:szCs w:val="19"/>
+              </w:rPr>
+              <w:t xml:space="preserve">RF04</w:t>
+            </w:r>
+          </w:p>
+        </w:tc>
+      </w:tr>
+      <w:tr>
+        <w:tc>
+          <w:tcPr>
+            <w:tcW w:type="dxa" w:w="900"/>
+            <w:vAlign w:val="center"/>
+          </w:tcPr>
+          <w:p>
+            <w:r>
+              <w:rPr>
+                <w:sz w:val="19"/>
+                <w:szCs w:val="19"/>
               </w:rPr>
               <w:t xml:space="preserve">US11</w:t>
             </w:r>
@@ -719,29 +825,31 @@
         </w:tc>
         <w:tc>
           <w:tcPr>
-            <w:tcW w:type="dxa" w:w="6960"/>
-          </w:tcPr>
-          <w:p>
-            <w:r>
-              <w:rPr>
-                <w:sz w:val="18"/>
-                <w:szCs w:val="18"/>
-              </w:rPr>
-              <w:t xml:space="preserve">Como Garçom, quero fechar a comanda com o cálculo automático do total e da taxa de serviço, para reduzir erro manual no fechamento.</w:t>
-            </w:r>
-          </w:p>
-        </w:tc>
-        <w:tc>
-          <w:tcPr>
-            <w:tcW w:type="dxa" w:w="1500"/>
-          </w:tcPr>
-          <w:p>
-            <w:r>
-              <w:rPr>
-                <w:sz w:val="18"/>
-                <w:szCs w:val="18"/>
-              </w:rPr>
-              <w:t xml:space="preserve">RF04</w:t>
+            <w:tcW w:type="dxa" w:w="6900"/>
+            <w:vAlign w:val="center"/>
+          </w:tcPr>
+          <w:p>
+            <w:r>
+              <w:rPr>
+                <w:sz w:val="19"/>
+                <w:szCs w:val="19"/>
+              </w:rPr>
+              <w:t xml:space="preserve">Como Garçom, quero registrar a restrição ou preferência alimentar que o cliente informa voluntariamente, escolhendo entre categorias comuns ou anotando um detalhe livre, para personalizar o atendimento sem depender só da minha memória — e sem que esse detalhe livre vire dado estruturado sobre o cliente.</w:t>
+            </w:r>
+          </w:p>
+        </w:tc>
+        <w:tc>
+          <w:tcPr>
+            <w:tcW w:type="dxa" w:w="1700"/>
+            <w:vAlign w:val="center"/>
+          </w:tcPr>
+          <w:p>
+            <w:r>
+              <w:rPr>
+                <w:sz w:val="19"/>
+                <w:szCs w:val="19"/>
+              </w:rPr>
+              <w:t xml:space="preserve">RF14 (novo, 23/08/2026)</w:t>
             </w:r>
           </w:p>
         </w:tc>
@@ -749,11 +857,17 @@
     </w:tbl>
     <w:p>
       <w:pPr>
-        <w:pStyle w:val="Heading1"/>
-        <w:spacing w:after="160" w:before="320"/>
-      </w:pPr>
-      <w:r>
-        <w:t xml:space="preserve">4. 🟠 Extra — Condicionado a sobrar tempo</w:t>
+        <w:spacing w:after="140" w:before="280"/>
+      </w:pPr>
+      <w:r>
+        <w:rPr>
+          <w:b/>
+          <w:bCs/>
+          <w:color w:val="B45F06"/>
+          <w:sz w:val="26"/>
+          <w:szCs w:val="26"/>
+        </w:rPr>
+        <w:t xml:space="preserve">4. Extra — Condicionado a sobrar tempo</w:t>
       </w:r>
     </w:p>
     <w:p>
@@ -766,7 +880,7 @@
     </w:p>
     <w:tbl>
       <w:tblPr>
-        <w:tblW w:type="dxa" w:w="9360"/>
+        <w:tblW w:type="dxa" w:w="9500"/>
         <w:tblBorders>
           <w:top w:val="single" w:color="auto" w:sz="4"/>
           <w:left w:val="single" w:color="auto" w:sz="4"/>
@@ -778,8 +892,8 @@
       </w:tblPr>
       <w:tblGrid>
         <w:gridCol w:w="900"/>
-        <w:gridCol w:w="6960"/>
-        <w:gridCol w:w="1500"/>
+        <w:gridCol w:w="6900"/>
+        <w:gridCol w:w="1700"/>
       </w:tblGrid>
       <w:tr>
         <w:trPr>
@@ -788,7 +902,8 @@
         <w:tc>
           <w:tcPr>
             <w:tcW w:type="dxa" w:w="900"/>
-            <w:shd w:fill="2F5233" w:val="clear"/>
+            <w:shd w:fill="B45F06" w:val="clear"/>
+            <w:vAlign w:val="center"/>
           </w:tcPr>
           <w:p>
             <w:r>
@@ -796,8 +911,8 @@
                 <w:b/>
                 <w:bCs/>
                 <w:color w:val="FFFFFF"/>
-                <w:sz w:val="18"/>
-                <w:szCs w:val="18"/>
+                <w:sz w:val="19"/>
+                <w:szCs w:val="19"/>
               </w:rPr>
               <w:t xml:space="preserve">ID</w:t>
             </w:r>
@@ -805,8 +920,9 @@
         </w:tc>
         <w:tc>
           <w:tcPr>
-            <w:tcW w:type="dxa" w:w="6960"/>
-            <w:shd w:fill="2F5233" w:val="clear"/>
+            <w:tcW w:type="dxa" w:w="6900"/>
+            <w:shd w:fill="B45F06" w:val="clear"/>
+            <w:vAlign w:val="center"/>
           </w:tcPr>
           <w:p>
             <w:r>
@@ -814,8 +930,8 @@
                 <w:b/>
                 <w:bCs/>
                 <w:color w:val="FFFFFF"/>
-                <w:sz w:val="18"/>
-                <w:szCs w:val="18"/>
+                <w:sz w:val="19"/>
+                <w:szCs w:val="19"/>
               </w:rPr>
               <w:t xml:space="preserve">User Story</w:t>
             </w:r>
@@ -823,8 +939,9 @@
         </w:tc>
         <w:tc>
           <w:tcPr>
-            <w:tcW w:type="dxa" w:w="1500"/>
-            <w:shd w:fill="2F5233" w:val="clear"/>
+            <w:tcW w:type="dxa" w:w="1700"/>
+            <w:shd w:fill="B45F06" w:val="clear"/>
+            <w:vAlign w:val="center"/>
           </w:tcPr>
           <w:p>
             <w:r>
@@ -832,8 +949,8 @@
                 <w:b/>
                 <w:bCs/>
                 <w:color w:val="FFFFFF"/>
-                <w:sz w:val="18"/>
-                <w:szCs w:val="18"/>
+                <w:sz w:val="19"/>
+                <w:szCs w:val="19"/>
               </w:rPr>
               <w:t xml:space="preserve">RF de origem</w:t>
             </w:r>
@@ -844,12 +961,13 @@
         <w:tc>
           <w:tcPr>
             <w:tcW w:type="dxa" w:w="900"/>
-          </w:tcPr>
-          <w:p>
-            <w:r>
-              <w:rPr>
-                <w:sz w:val="18"/>
-                <w:szCs w:val="18"/>
+            <w:vAlign w:val="center"/>
+          </w:tcPr>
+          <w:p>
+            <w:r>
+              <w:rPr>
+                <w:sz w:val="19"/>
+                <w:szCs w:val="19"/>
               </w:rPr>
               <w:t xml:space="preserve">US12</w:t>
             </w:r>
@@ -857,13 +975,14 @@
         </w:tc>
         <w:tc>
           <w:tcPr>
-            <w:tcW w:type="dxa" w:w="6960"/>
-          </w:tcPr>
-          <w:p>
-            <w:r>
-              <w:rPr>
-                <w:sz w:val="18"/>
-                <w:szCs w:val="18"/>
+            <w:tcW w:type="dxa" w:w="6900"/>
+            <w:vAlign w:val="center"/>
+          </w:tcPr>
+          <w:p>
+            <w:r>
+              <w:rPr>
+                <w:sz w:val="19"/>
+                <w:szCs w:val="19"/>
               </w:rPr>
               <w:t xml:space="preserve">Como Cliente, quero consultar o cardápio digital via QR code ou tablet com fotos, preço e flags dietéticas, para identificar mais facilmente opções que atendam minha restrição alimentar.</w:t>
             </w:r>
@@ -871,13 +990,14 @@
         </w:tc>
         <w:tc>
           <w:tcPr>
-            <w:tcW w:type="dxa" w:w="1500"/>
-          </w:tcPr>
-          <w:p>
-            <w:r>
-              <w:rPr>
-                <w:sz w:val="18"/>
-                <w:szCs w:val="18"/>
+            <w:tcW w:type="dxa" w:w="1700"/>
+            <w:vAlign w:val="center"/>
+          </w:tcPr>
+          <w:p>
+            <w:r>
+              <w:rPr>
+                <w:sz w:val="19"/>
+                <w:szCs w:val="19"/>
               </w:rPr>
               <w:t xml:space="preserve">RF05</w:t>
             </w:r>
@@ -888,12 +1008,13 @@
         <w:tc>
           <w:tcPr>
             <w:tcW w:type="dxa" w:w="900"/>
-          </w:tcPr>
-          <w:p>
-            <w:r>
-              <w:rPr>
-                <w:sz w:val="18"/>
-                <w:szCs w:val="18"/>
+            <w:vAlign w:val="center"/>
+          </w:tcPr>
+          <w:p>
+            <w:r>
+              <w:rPr>
+                <w:sz w:val="19"/>
+                <w:szCs w:val="19"/>
               </w:rPr>
               <w:t xml:space="preserve">US13</w:t>
             </w:r>
@@ -901,13 +1022,14 @@
         </w:tc>
         <w:tc>
           <w:tcPr>
-            <w:tcW w:type="dxa" w:w="6960"/>
-          </w:tcPr>
-          <w:p>
-            <w:r>
-              <w:rPr>
-                <w:sz w:val="18"/>
-                <w:szCs w:val="18"/>
+            <w:tcW w:type="dxa" w:w="6900"/>
+            <w:vAlign w:val="center"/>
+          </w:tcPr>
+          <w:p>
+            <w:r>
+              <w:rPr>
+                <w:sz w:val="19"/>
+                <w:szCs w:val="19"/>
               </w:rPr>
               <w:t xml:space="preserve">Como Cliente, quero consultar minha comanda em tempo real (itens já lançados e valor parcial), para evitar disputas de conta no fechamento.</w:t>
             </w:r>
@@ -915,13 +1037,14 @@
         </w:tc>
         <w:tc>
           <w:tcPr>
-            <w:tcW w:type="dxa" w:w="1500"/>
-          </w:tcPr>
-          <w:p>
-            <w:r>
-              <w:rPr>
-                <w:sz w:val="18"/>
-                <w:szCs w:val="18"/>
+            <w:tcW w:type="dxa" w:w="1700"/>
+            <w:vAlign w:val="center"/>
+          </w:tcPr>
+          <w:p>
+            <w:r>
+              <w:rPr>
+                <w:sz w:val="19"/>
+                <w:szCs w:val="19"/>
               </w:rPr>
               <w:t xml:space="preserve">RF13</w:t>
             </w:r>
@@ -943,10 +1066,12 @@
         <w:spacing w:after="160"/>
       </w:pPr>
       <w:r>
-        <w:t xml:space="preserve">Toda alteração de RF em GASTRA_Requisitos_RN.docx deve ser refletida aqui no mesmo PR — assim como já é regra para a Matriz de Rastreabilidade (ver CONTRIBUTING.md, seção 2). Nenhuma User Story deve existir sem RF de origem correspondente.</w:t>
+        <w:t xml:space="preserve">Toda alteração de RF em GASTRA_Requisitos_RN.docx deve ser refletida aqui no mesmo PR — assim como já é regra para a Matriz de Rastreabilidade. Nenhuma User Story deve existir sem RF de origem correspondente, e nenhum RF ativo deve ficar sem User Story correspondente.</w:t>
       </w:r>
     </w:p>
     <w:sectPr>
+      <w:headerReference w:type="default" r:id="rId7"/>
+      <w:footerReference w:type="default" r:id="rId8"/>
       <w:pgSz w:w="11906" w:h="16838" w:orient="portrait"/>
       <w:pgMar w:top="1134" w:right="1134" w:bottom="1134" w:left="1134" w:header="708" w:footer="708" w:gutter="0"/>
       <w:pgNumType/>
@@ -997,6 +1122,54 @@
 </w:endnotes>
 </file>
 
+<file path=word/footer1.xml><?xml version="1.0" encoding="utf-8"?>
+<w:ftr xmlns:wpc="http://schemas.microsoft.com/office/word/2010/wordprocessingCanvas" xmlns:mc="http://schemas.openxmlformats.org/markup-compatibility/2006" xmlns:o="urn:schemas-microsoft-com:office:office" xmlns:r="http://schemas.openxmlformats.org/officeDocument/2006/relationships" xmlns:m="http://schemas.openxmlformats.org/officeDocument/2006/math" xmlns:v="urn:schemas-microsoft-com:vml" xmlns:wp14="http://schemas.microsoft.com/office/word/2010/wordprocessingDrawing" xmlns:wp="http://schemas.openxmlformats.org/drawingml/2006/wordprocessingDrawing" xmlns:w10="urn:schemas-microsoft-com:office:word" xmlns:w="http://schemas.openxmlformats.org/wordprocessingml/2006/main" xmlns:w14="http://schemas.microsoft.com/office/word/2010/wordml" xmlns:w15="http://schemas.microsoft.com/office/word/2012/wordml" xmlns:wpg="http://schemas.microsoft.com/office/word/2010/wordprocessingGroup" xmlns:wpi="http://schemas.microsoft.com/office/word/2010/wordprocessingInk" xmlns:wne="http://schemas.microsoft.com/office/word/2006/wordml" xmlns:wps="http://schemas.microsoft.com/office/word/2010/wordprocessingShape">
+  <w:p>
+    <w:pPr>
+      <w:jc w:val="center"/>
+    </w:pPr>
+    <w:r>
+      <w:rPr>
+        <w:color w:val="595959"/>
+        <w:sz w:val="16"/>
+        <w:szCs w:val="16"/>
+      </w:rPr>
+      <w:t xml:space="preserve">Página </w:t>
+    </w:r>
+    <w:r>
+      <w:rPr>
+        <w:color w:val="595959"/>
+        <w:sz w:val="16"/>
+        <w:szCs w:val="16"/>
+      </w:rPr>
+      <w:fldChar w:fldCharType="begin"/>
+      <w:instrText xml:space="preserve">PAGE</w:instrText>
+      <w:fldChar w:fldCharType="separate"/>
+      <w:fldChar w:fldCharType="end"/>
+    </w:r>
+    <w:r>
+      <w:rPr>
+        <w:color w:val="595959"/>
+        <w:sz w:val="16"/>
+        <w:szCs w:val="16"/>
+      </w:rPr>
+      <w:t xml:space="preserve"> de </w:t>
+    </w:r>
+    <w:r>
+      <w:rPr>
+        <w:color w:val="595959"/>
+        <w:sz w:val="16"/>
+        <w:szCs w:val="16"/>
+      </w:rPr>
+      <w:fldChar w:fldCharType="begin"/>
+      <w:instrText xml:space="preserve">NUMPAGES</w:instrText>
+      <w:fldChar w:fldCharType="separate"/>
+      <w:fldChar w:fldCharType="end"/>
+    </w:r>
+  </w:p>
+</w:ftr>
+</file>
+
 <file path=word/footnotes.xml><?xml version="1.0" encoding="utf-8"?>
 <w:footnotes xmlns:wpc="http://schemas.microsoft.com/office/word/2010/wordprocessingCanvas" xmlns:mc="http://schemas.openxmlformats.org/markup-compatibility/2006" xmlns:o="urn:schemas-microsoft-com:office:office" xmlns:r="http://schemas.openxmlformats.org/officeDocument/2006/relationships" xmlns:m="http://schemas.openxmlformats.org/officeDocument/2006/math" xmlns:v="urn:schemas-microsoft-com:vml" xmlns:wp14="http://schemas.microsoft.com/office/word/2010/wordprocessingDrawing" xmlns:wp="http://schemas.openxmlformats.org/drawingml/2006/wordprocessingDrawing" xmlns:w10="urn:schemas-microsoft-com:office:word" xmlns:w="http://schemas.openxmlformats.org/wordprocessingml/2006/main" xmlns:w14="http://schemas.microsoft.com/office/word/2010/wordml" xmlns:w15="http://schemas.microsoft.com/office/word/2012/wordml" xmlns:wpg="http://schemas.microsoft.com/office/word/2010/wordprocessingGroup" xmlns:wpi="http://schemas.microsoft.com/office/word/2010/wordprocessingInk" xmlns:wne="http://schemas.microsoft.com/office/word/2006/wordml" xmlns:wps="http://schemas.microsoft.com/office/word/2010/wordprocessingShape" mc:Ignorable="w14 w15 wp14">
   <w:footnote w:type="separator" w:id="-1">
@@ -1032,6 +1205,24 @@
     </w:p>
   </w:footnote>
 </w:footnotes>
+</file>
+
+<file path=word/header1.xml><?xml version="1.0" encoding="utf-8"?>
+<w:hdr xmlns:wpc="http://schemas.microsoft.com/office/word/2010/wordprocessingCanvas" xmlns:mc="http://schemas.openxmlformats.org/markup-compatibility/2006" xmlns:o="urn:schemas-microsoft-com:office:office" xmlns:r="http://schemas.openxmlformats.org/officeDocument/2006/relationships" xmlns:m="http://schemas.openxmlformats.org/officeDocument/2006/math" xmlns:v="urn:schemas-microsoft-com:vml" xmlns:wp14="http://schemas.microsoft.com/office/word/2010/wordprocessingDrawing" xmlns:wp="http://schemas.openxmlformats.org/drawingml/2006/wordprocessingDrawing" xmlns:w10="urn:schemas-microsoft-com:office:word" xmlns:w="http://schemas.openxmlformats.org/wordprocessingml/2006/main" xmlns:w14="http://schemas.microsoft.com/office/word/2010/wordml" xmlns:w15="http://schemas.microsoft.com/office/word/2012/wordml" xmlns:wpg="http://schemas.microsoft.com/office/word/2010/wordprocessingGroup" xmlns:wpi="http://schemas.microsoft.com/office/word/2010/wordprocessingInk" xmlns:wne="http://schemas.microsoft.com/office/word/2006/wordml" xmlns:wps="http://schemas.microsoft.com/office/word/2010/wordprocessingShape" xmlns:cx="http://schemas.microsoft.com/office/drawing/2014/chartex" xmlns:cx1="http://schemas.microsoft.com/office/drawing/2015/9/8/chartex" xmlns:cx2="http://schemas.microsoft.com/office/drawing/2015/10/21/chartex" xmlns:cx3="http://schemas.microsoft.com/office/drawing/2016/5/9/chartex" xmlns:cx4="http://schemas.microsoft.com/office/drawing/2016/5/10/chartex" xmlns:cx5="http://schemas.microsoft.com/office/drawing/2016/5/11/chartex" xmlns:cx6="http://schemas.microsoft.com/office/drawing/2016/5/12/chartex" xmlns:cx7="http://schemas.microsoft.com/office/drawing/2016/5/13/chartex" xmlns:cx8="http://schemas.microsoft.com/office/drawing/2016/5/14/chartex" xmlns:w16cid="http://schemas.microsoft.com/office/word/2016/wordml/cid" xmlns:w16se="http://schemas.microsoft.com/office/word/2015/wordml/symex">
+  <w:p>
+    <w:pPr>
+      <w:jc w:val="right"/>
+    </w:pPr>
+    <w:r>
+      <w:rPr>
+        <w:color w:val="595959"/>
+        <w:sz w:val="16"/>
+        <w:szCs w:val="16"/>
+      </w:rPr>
+      <w:t xml:space="preserve">GASTRA — User Stories</w:t>
+    </w:r>
+  </w:p>
+</w:hdr>
 </file>
 
 <file path=word/numbering.xml><?xml version="1.0" encoding="utf-8"?>
@@ -1118,15 +1309,6 @@
       <w:pPr>
         <w:ind w:left="6480" w:hanging="360"/>
       </w:pPr>
-    </w:lvl>
-  </w:abstractNum>
-  <w:abstractNum w:abstractNumId="2" w15:restartNumberingAfterBreak="0">
-    <w:multiLevelType w:val="hybridMultilevel"/>
-    <w:lvl w:ilvl="0" w15:tentative="1">
-      <w:start w:val="1"/>
-      <w:numFmt w:val="bullet"/>
-      <w:lvlText w:val="•"/>
-      <w:lvlJc w:val="left"/>
     </w:lvl>
   </w:abstractNum>
   <w:num w:numId="1">
@@ -1141,7 +1323,13 @@
 <file path=word/styles.xml><?xml version="1.0" encoding="utf-8"?>
 <w:styles xmlns:mc="http://schemas.openxmlformats.org/markup-compatibility/2006" xmlns:r="http://schemas.openxmlformats.org/officeDocument/2006/relationships" xmlns:w="http://schemas.openxmlformats.org/wordprocessingml/2006/main" xmlns:w14="http://schemas.microsoft.com/office/word/2010/wordml" xmlns:w15="http://schemas.microsoft.com/office/word/2012/wordml" mc:Ignorable="w14 w15">
   <w:docDefaults>
-    <w:rPrDefault/>
+    <w:rPrDefault>
+      <w:rPr>
+        <w:rFonts w:ascii="Calibri" w:cs="Calibri" w:eastAsia="Calibri" w:hAnsi="Calibri"/>
+        <w:sz w:val="21"/>
+        <w:szCs w:val="21"/>
+      </w:rPr>
+    </w:rPrDefault>
     <w:pPrDefault/>
   </w:docDefaults>
   <w:style w:type="paragraph" w:styleId="Title">
@@ -1315,5 +1503,23 @@
       <w:szCs w:val="20"/>
     </w:rPr>
   </w:style>
+  <w:style w:type="paragraph" w:styleId="Heading1">
+    <w:name w:val="Heading 1"/>
+    <w:basedOn w:val="Normal"/>
+    <w:next w:val="Normal"/>
+    <w:qFormat/>
+    <w:pPr>
+      <w:spacing w:after="160" w:before="320"/>
+      <w:outlineLvl w:val="0"/>
+    </w:pPr>
+    <w:rPr>
+      <w:rFonts w:ascii="Calibri" w:cs="Calibri" w:eastAsia="Calibri" w:hAnsi="Calibri"/>
+      <w:b/>
+      <w:bCs/>
+      <w:color w:val="1F3864"/>
+      <w:sz w:val="30"/>
+      <w:szCs w:val="30"/>
+    </w:rPr>
+  </w:style>
 </w:styles>
 </file>
</xml_diff>

<commit_message>
docs: reorganiza requisitos, adiciona instrumento de coleta, referências e KPIs
</commit_message>
<xml_diff>
--- a/docs/requisitos/GASTRA_User_Stories.docx
+++ b/docs/requisitos/GASTRA_User_Stories.docx
@@ -4,31 +4,31 @@
   <w:body>
     <w:p>
       <w:pPr>
-        <w:spacing w:before="800" w:after="120"/>
-        <w:jc w:val="center"/>
+        <w:pStyle w:val="Ttulo"/>
       </w:pPr>
       <w:r>
         <w:rPr>
-          <w:b/>
-          <w:bCs/>
-          <w:color w:val="1F3864"/>
-          <w:sz w:val="56"/>
-          <w:szCs w:val="56"/>
+          <w:rFonts w:ascii="Times New Roman" w:hAnsi="Times New Roman" w:cs="Times New Roman"/>
         </w:rPr>
         <w:t>GASTRA</w:t>
       </w:r>
     </w:p>
     <w:p>
       <w:pPr>
-        <w:spacing w:after="60"/>
-        <w:jc w:val="center"/>
+        <w:spacing w:before="300" w:after="150"/>
+        <w:outlineLvl w:val="0"/>
+        <w:rPr>
+          <w:b/>
+          <w:bCs/>
+          <w:sz w:val="32"/>
+          <w:szCs w:val="32"/>
+        </w:rPr>
       </w:pPr>
       <w:proofErr w:type="spellStart"/>
       <w:r>
         <w:rPr>
           <w:b/>
           <w:bCs/>
-          <w:color w:val="3B6E8F"/>
           <w:sz w:val="32"/>
           <w:szCs w:val="32"/>
         </w:rPr>
@@ -39,7 +39,6 @@
         <w:rPr>
           <w:b/>
           <w:bCs/>
-          <w:color w:val="3B6E8F"/>
           <w:sz w:val="32"/>
           <w:szCs w:val="32"/>
         </w:rPr>
@@ -47,185 +46,78 @@
       </w:r>
     </w:p>
     <w:p>
-      <w:pPr>
-        <w:spacing w:after="600"/>
-        <w:jc w:val="center"/>
-      </w:pPr>
-    </w:p>
-    <w:p>
-      <w:pPr>
-        <w:spacing w:after="40"/>
-        <w:jc w:val="center"/>
-      </w:pPr>
       <w:r>
-        <w:rPr>
-          <w:sz w:val="22"/>
-          <w:szCs w:val="22"/>
-        </w:rPr>
         <w:t>TG — FATEC Araraquara</w:t>
       </w:r>
     </w:p>
     <w:p>
-      <w:pPr>
-        <w:spacing w:after="40"/>
-        <w:jc w:val="center"/>
-      </w:pPr>
       <w:r>
-        <w:rPr>
-          <w:sz w:val="22"/>
-          <w:szCs w:val="22"/>
-        </w:rPr>
         <w:t xml:space="preserve">Autores: Daniel </w:t>
       </w:r>
       <w:proofErr w:type="spellStart"/>
       <w:r>
-        <w:rPr>
-          <w:sz w:val="22"/>
-          <w:szCs w:val="22"/>
-        </w:rPr>
         <w:t>Velluto</w:t>
       </w:r>
       <w:proofErr w:type="spellEnd"/>
       <w:r>
-        <w:rPr>
-          <w:sz w:val="22"/>
-          <w:szCs w:val="22"/>
-        </w:rPr>
         <w:t xml:space="preserve"> Bento e Pedro </w:t>
       </w:r>
       <w:proofErr w:type="spellStart"/>
       <w:r>
-        <w:rPr>
-          <w:sz w:val="22"/>
-          <w:szCs w:val="22"/>
-        </w:rPr>
         <w:t>Luis</w:t>
       </w:r>
       <w:proofErr w:type="spellEnd"/>
       <w:r>
-        <w:rPr>
-          <w:sz w:val="22"/>
-          <w:szCs w:val="22"/>
-        </w:rPr>
         <w:t xml:space="preserve"> </w:t>
       </w:r>
       <w:proofErr w:type="spellStart"/>
       <w:r>
-        <w:rPr>
-          <w:sz w:val="22"/>
-          <w:szCs w:val="22"/>
-        </w:rPr>
         <w:t>Otrente</w:t>
       </w:r>
       <w:proofErr w:type="spellEnd"/>
       <w:r>
-        <w:rPr>
-          <w:sz w:val="22"/>
-          <w:szCs w:val="22"/>
-        </w:rPr>
         <w:t xml:space="preserve"> de Campos</w:t>
       </w:r>
     </w:p>
     <w:p>
-      <w:pPr>
-        <w:spacing w:after="40"/>
-        <w:jc w:val="center"/>
-      </w:pPr>
       <w:r>
-        <w:rPr>
-          <w:sz w:val="22"/>
-          <w:szCs w:val="22"/>
-        </w:rPr>
         <w:t>Orientador: Prof. Me. Leonardo José de Lima Ferrucci</w:t>
       </w:r>
     </w:p>
-    <w:p>
-      <w:pPr>
-        <w:spacing w:after="900"/>
-        <w:jc w:val="center"/>
-      </w:pPr>
-      <w:r>
-        <w:rPr>
-          <w:color w:val="595959"/>
-          <w:sz w:val="20"/>
-          <w:szCs w:val="20"/>
-        </w:rPr>
-        <w:t>Versão: 2</w:t>
-      </w:r>
-      <w:r>
-        <w:rPr>
-          <w:color w:val="595959"/>
-          <w:sz w:val="20"/>
-          <w:szCs w:val="20"/>
-        </w:rPr>
-        <w:t>7</w:t>
-      </w:r>
-      <w:r>
-        <w:rPr>
-          <w:color w:val="595959"/>
-          <w:sz w:val="20"/>
-          <w:szCs w:val="20"/>
-        </w:rPr>
-        <w:t>/08/2026</w:t>
-      </w:r>
-    </w:p>
-    <w:p>
-      <w:r>
-        <w:br w:type="page"/>
-      </w:r>
-    </w:p>
-    <w:p>
-      <w:pPr>
-        <w:pStyle w:val="Ttulo1"/>
-      </w:pPr>
-      <w:r>
-        <w:lastRenderedPageBreak/>
-        <w:t>1. Sobre este documento</w:t>
-      </w:r>
-    </w:p>
-    <w:p>
-      <w:pPr>
-        <w:spacing w:after="160"/>
-      </w:pPr>
-      <w:r>
-        <w:t xml:space="preserve">Cada </w:t>
-      </w:r>
-      <w:proofErr w:type="spellStart"/>
-      <w:r>
-        <w:t>User</w:t>
-      </w:r>
-      <w:proofErr w:type="spellEnd"/>
-      <w:r>
-        <w:t xml:space="preserve"> Story usa o formato "Como [ator], quero [ação], para [benefício]" e </w:t>
-      </w:r>
-      <w:proofErr w:type="gramStart"/>
-      <w:r>
-        <w:t>referencia</w:t>
-      </w:r>
-      <w:proofErr w:type="gramEnd"/>
-      <w:r>
-        <w:t xml:space="preserve"> o RF de origem, para manter rastreabilidade com o</w:t>
-      </w:r>
-      <w:r>
-        <w:t>s</w:t>
-      </w:r>
-      <w:r>
-        <w:t xml:space="preserve"> Requisitos e a Matriz de Rastreabilidade. As stories estão organizadas em três grupos de prioridade, que refletem o status de escopo vigente — a ordem de implementação deve seguir essa hierarquia, não a ordem de leitura dos RF.</w:t>
-      </w:r>
-    </w:p>
+    <w:p/>
     <w:p>
       <w:pPr>
         <w:spacing w:before="280" w:after="140"/>
-      </w:pPr>
-      <w:r>
         <w:rPr>
+          <w:rFonts w:ascii="Calibri" w:eastAsia="Calibri" w:hAnsi="Calibri" w:cs="Calibri"/>
           <w:b/>
           <w:bCs/>
           <w:color w:val="3B6E8F"/>
           <w:sz w:val="26"/>
           <w:szCs w:val="26"/>
         </w:rPr>
-        <w:t>2. Foco — Blocos analíticos (BI, Ciência de Dados, PL, LGPD)</w:t>
+      </w:pPr>
+      <w:r>
+        <w:rPr>
+          <w:rFonts w:ascii="Calibri" w:eastAsia="Calibri" w:hAnsi="Calibri" w:cs="Calibri"/>
+          <w:b/>
+          <w:bCs/>
+          <w:color w:val="3B6E8F"/>
+          <w:sz w:val="26"/>
+          <w:szCs w:val="26"/>
+        </w:rPr>
+        <w:t>1</w:t>
+      </w:r>
+      <w:r>
+        <w:rPr>
+          <w:rFonts w:ascii="Calibri" w:eastAsia="Calibri" w:hAnsi="Calibri" w:cs="Calibri"/>
+          <w:b/>
+          <w:bCs/>
+          <w:color w:val="3B6E8F"/>
+          <w:sz w:val="26"/>
+          <w:szCs w:val="26"/>
+        </w:rPr>
+        <w:t>. Blocos analíticos (BI, Ciência de Dados, PL, LGPD)</w:t>
       </w:r>
     </w:p>
     <w:tbl>
@@ -251,12 +143,6 @@
         <w:gridCol w:w="1700"/>
       </w:tblGrid>
       <w:tr>
-        <w:tblPrEx>
-          <w:tblCellMar>
-            <w:top w:w="0" w:type="dxa"/>
-            <w:bottom w:w="0" w:type="dxa"/>
-          </w:tblCellMar>
-        </w:tblPrEx>
         <w:trPr>
           <w:tblHeader/>
         </w:trPr>
@@ -331,12 +217,6 @@
         </w:tc>
       </w:tr>
       <w:tr>
-        <w:tblPrEx>
-          <w:tblCellMar>
-            <w:top w:w="0" w:type="dxa"/>
-            <w:bottom w:w="0" w:type="dxa"/>
-          </w:tblCellMar>
-        </w:tblPrEx>
         <w:tc>
           <w:tcPr>
             <w:tcW w:w="900" w:type="dxa"/>
@@ -384,12 +264,6 @@
         </w:tc>
       </w:tr>
       <w:tr>
-        <w:tblPrEx>
-          <w:tblCellMar>
-            <w:top w:w="0" w:type="dxa"/>
-            <w:bottom w:w="0" w:type="dxa"/>
-          </w:tblCellMar>
-        </w:tblPrEx>
         <w:tc>
           <w:tcPr>
             <w:tcW w:w="900" w:type="dxa"/>
@@ -437,12 +311,6 @@
         </w:tc>
       </w:tr>
       <w:tr>
-        <w:tblPrEx>
-          <w:tblCellMar>
-            <w:top w:w="0" w:type="dxa"/>
-            <w:bottom w:w="0" w:type="dxa"/>
-          </w:tblCellMar>
-        </w:tblPrEx>
         <w:tc>
           <w:tcPr>
             <w:tcW w:w="900" w:type="dxa"/>
@@ -490,12 +358,6 @@
         </w:tc>
       </w:tr>
       <w:tr>
-        <w:tblPrEx>
-          <w:tblCellMar>
-            <w:top w:w="0" w:type="dxa"/>
-            <w:bottom w:w="0" w:type="dxa"/>
-          </w:tblCellMar>
-        </w:tblPrEx>
         <w:tc>
           <w:tcPr>
             <w:tcW w:w="900" w:type="dxa"/>
@@ -543,12 +405,6 @@
         </w:tc>
       </w:tr>
       <w:tr>
-        <w:tblPrEx>
-          <w:tblCellMar>
-            <w:top w:w="0" w:type="dxa"/>
-            <w:bottom w:w="0" w:type="dxa"/>
-          </w:tblCellMar>
-        </w:tblPrEx>
         <w:tc>
           <w:tcPr>
             <w:tcW w:w="900" w:type="dxa"/>
@@ -596,12 +452,6 @@
         </w:tc>
       </w:tr>
       <w:tr>
-        <w:tblPrEx>
-          <w:tblCellMar>
-            <w:top w:w="0" w:type="dxa"/>
-            <w:bottom w:w="0" w:type="dxa"/>
-          </w:tblCellMar>
-        </w:tblPrEx>
         <w:tc>
           <w:tcPr>
             <w:tcW w:w="900" w:type="dxa"/>
@@ -652,24 +502,36 @@
     <w:p>
       <w:pPr>
         <w:spacing w:before="280" w:after="140"/>
-      </w:pPr>
-      <w:r>
         <w:rPr>
+          <w:rFonts w:ascii="Calibri" w:eastAsia="Calibri" w:hAnsi="Calibri" w:cs="Calibri"/>
           <w:b/>
           <w:bCs/>
           <w:color w:val="38761D"/>
           <w:sz w:val="26"/>
           <w:szCs w:val="26"/>
         </w:rPr>
-        <w:t>3. Adicional — Núcleo do módulo de comandas</w:t>
-      </w:r>
-    </w:p>
-    <w:p>
-      <w:pPr>
-        <w:spacing w:after="160"/>
       </w:pPr>
       <w:r>
-        <w:t>Necessário para alimentar os blocos analíticos com dado operacional real — não é o foco da entrega, mas sem ele os blocos acima não têm dado para funcionar de ponta a ponta.</w:t>
+        <w:rPr>
+          <w:rFonts w:ascii="Calibri" w:eastAsia="Calibri" w:hAnsi="Calibri" w:cs="Calibri"/>
+          <w:b/>
+          <w:bCs/>
+          <w:color w:val="38761D"/>
+          <w:sz w:val="26"/>
+          <w:szCs w:val="26"/>
+        </w:rPr>
+        <w:t>2</w:t>
+      </w:r>
+      <w:r>
+        <w:rPr>
+          <w:rFonts w:ascii="Calibri" w:eastAsia="Calibri" w:hAnsi="Calibri" w:cs="Calibri"/>
+          <w:b/>
+          <w:bCs/>
+          <w:color w:val="38761D"/>
+          <w:sz w:val="26"/>
+          <w:szCs w:val="26"/>
+        </w:rPr>
+        <w:t>. Núcleo do módulo de comandas</w:t>
       </w:r>
     </w:p>
     <w:tbl>
@@ -695,12 +557,6 @@
         <w:gridCol w:w="1700"/>
       </w:tblGrid>
       <w:tr>
-        <w:tblPrEx>
-          <w:tblCellMar>
-            <w:top w:w="0" w:type="dxa"/>
-            <w:bottom w:w="0" w:type="dxa"/>
-          </w:tblCellMar>
-        </w:tblPrEx>
         <w:trPr>
           <w:tblHeader/>
         </w:trPr>
@@ -775,12 +631,6 @@
         </w:tc>
       </w:tr>
       <w:tr>
-        <w:tblPrEx>
-          <w:tblCellMar>
-            <w:top w:w="0" w:type="dxa"/>
-            <w:bottom w:w="0" w:type="dxa"/>
-          </w:tblCellMar>
-        </w:tblPrEx>
         <w:tc>
           <w:tcPr>
             <w:tcW w:w="900" w:type="dxa"/>
@@ -828,12 +678,6 @@
         </w:tc>
       </w:tr>
       <w:tr>
-        <w:tblPrEx>
-          <w:tblCellMar>
-            <w:top w:w="0" w:type="dxa"/>
-            <w:bottom w:w="0" w:type="dxa"/>
-          </w:tblCellMar>
-        </w:tblPrEx>
         <w:tc>
           <w:tcPr>
             <w:tcW w:w="900" w:type="dxa"/>
@@ -881,12 +725,6 @@
         </w:tc>
       </w:tr>
       <w:tr>
-        <w:tblPrEx>
-          <w:tblCellMar>
-            <w:top w:w="0" w:type="dxa"/>
-            <w:bottom w:w="0" w:type="dxa"/>
-          </w:tblCellMar>
-        </w:tblPrEx>
         <w:tc>
           <w:tcPr>
             <w:tcW w:w="900" w:type="dxa"/>
@@ -934,12 +772,6 @@
         </w:tc>
       </w:tr>
       <w:tr>
-        <w:tblPrEx>
-          <w:tblCellMar>
-            <w:top w:w="0" w:type="dxa"/>
-            <w:bottom w:w="0" w:type="dxa"/>
-          </w:tblCellMar>
-        </w:tblPrEx>
         <w:tc>
           <w:tcPr>
             <w:tcW w:w="900" w:type="dxa"/>
@@ -987,12 +819,6 @@
         </w:tc>
       </w:tr>
       <w:tr>
-        <w:tblPrEx>
-          <w:tblCellMar>
-            <w:top w:w="0" w:type="dxa"/>
-            <w:bottom w:w="0" w:type="dxa"/>
-          </w:tblCellMar>
-        </w:tblPrEx>
         <w:tc>
           <w:tcPr>
             <w:tcW w:w="900" w:type="dxa"/>
@@ -1043,27 +869,36 @@
     <w:p>
       <w:pPr>
         <w:spacing w:before="280" w:after="140"/>
-      </w:pPr>
-      <w:r>
         <w:rPr>
+          <w:rFonts w:ascii="Calibri" w:eastAsia="Calibri" w:hAnsi="Calibri" w:cs="Calibri"/>
           <w:b/>
           <w:bCs/>
           <w:color w:val="B45F06"/>
           <w:sz w:val="26"/>
           <w:szCs w:val="26"/>
         </w:rPr>
-        <w:t>4. Extra — Condicionado a sobrar tempo</w:t>
-      </w:r>
-    </w:p>
-    <w:p>
-      <w:pPr>
-        <w:spacing w:after="160"/>
       </w:pPr>
       <w:r>
-        <w:t>S</w:t>
+        <w:rPr>
+          <w:rFonts w:ascii="Calibri" w:eastAsia="Calibri" w:hAnsi="Calibri" w:cs="Calibri"/>
+          <w:b/>
+          <w:bCs/>
+          <w:color w:val="B45F06"/>
+          <w:sz w:val="26"/>
+          <w:szCs w:val="26"/>
+        </w:rPr>
+        <w:t>3</w:t>
       </w:r>
       <w:r>
-        <w:t>ó entram em desenvolvimento depois que o núcleo (comandas + os 4 blocos) tiver um MVP apresentável.</w:t>
+        <w:rPr>
+          <w:rFonts w:ascii="Calibri" w:eastAsia="Calibri" w:hAnsi="Calibri" w:cs="Calibri"/>
+          <w:b/>
+          <w:bCs/>
+          <w:color w:val="B45F06"/>
+          <w:sz w:val="26"/>
+          <w:szCs w:val="26"/>
+        </w:rPr>
+        <w:t>. Condicionado a sobrar tempo</w:t>
       </w:r>
     </w:p>
     <w:tbl>
@@ -1089,12 +924,6 @@
         <w:gridCol w:w="1700"/>
       </w:tblGrid>
       <w:tr>
-        <w:tblPrEx>
-          <w:tblCellMar>
-            <w:top w:w="0" w:type="dxa"/>
-            <w:bottom w:w="0" w:type="dxa"/>
-          </w:tblCellMar>
-        </w:tblPrEx>
         <w:trPr>
           <w:tblHeader/>
         </w:trPr>
@@ -1169,12 +998,6 @@
         </w:tc>
       </w:tr>
       <w:tr>
-        <w:tblPrEx>
-          <w:tblCellMar>
-            <w:top w:w="0" w:type="dxa"/>
-            <w:bottom w:w="0" w:type="dxa"/>
-          </w:tblCellMar>
-        </w:tblPrEx>
         <w:tc>
           <w:tcPr>
             <w:tcW w:w="900" w:type="dxa"/>
@@ -1238,12 +1061,6 @@
         </w:tc>
       </w:tr>
       <w:tr>
-        <w:tblPrEx>
-          <w:tblCellMar>
-            <w:top w:w="0" w:type="dxa"/>
-            <w:bottom w:w="0" w:type="dxa"/>
-          </w:tblCellMar>
-        </w:tblPrEx>
         <w:tc>
           <w:tcPr>
             <w:tcW w:w="900" w:type="dxa"/>
@@ -1293,298 +1110,54 @@
     </w:tbl>
     <w:p>
       <w:pPr>
-        <w:spacing w:after="160"/>
+        <w:spacing w:before="280" w:after="140"/>
+        <w:rPr>
+          <w:rFonts w:ascii="Calibri" w:eastAsia="Calibri" w:hAnsi="Calibri" w:cs="Calibri"/>
+          <w:sz w:val="21"/>
+          <w:szCs w:val="21"/>
+        </w:rPr>
       </w:pPr>
     </w:p>
+    <w:p>
+      <w:pPr>
+        <w:spacing w:before="280" w:after="140"/>
+        <w:rPr>
+          <w:rFonts w:ascii="Calibri" w:eastAsia="Calibri" w:hAnsi="Calibri" w:cs="Calibri"/>
+          <w:sz w:val="21"/>
+          <w:szCs w:val="21"/>
+        </w:rPr>
+      </w:pPr>
+    </w:p>
+    <w:p>
+      <w:pPr>
+        <w:spacing w:before="280" w:after="140"/>
+        <w:rPr>
+          <w:rFonts w:ascii="Calibri" w:eastAsia="Calibri" w:hAnsi="Calibri" w:cs="Calibri"/>
+          <w:sz w:val="21"/>
+          <w:szCs w:val="21"/>
+        </w:rPr>
+      </w:pPr>
+    </w:p>
+    <w:p>
+      <w:pPr>
+        <w:spacing w:before="280" w:after="140"/>
+        <w:rPr>
+          <w:rFonts w:ascii="Calibri" w:eastAsia="Calibri" w:hAnsi="Calibri" w:cs="Calibri"/>
+          <w:sz w:val="21"/>
+          <w:szCs w:val="21"/>
+        </w:rPr>
+      </w:pPr>
+    </w:p>
+    <w:p/>
+    <w:p/>
     <w:sectPr>
-      <w:headerReference w:type="default" r:id="rId7"/>
-      <w:footerReference w:type="default" r:id="rId8"/>
       <w:pgSz w:w="11906" w:h="16838"/>
-      <w:pgMar w:top="1134" w:right="1134" w:bottom="1134" w:left="1134" w:header="708" w:footer="708" w:gutter="0"/>
-      <w:cols w:space="720"/>
+      <w:pgMar w:top="1417" w:right="1701" w:bottom="1417" w:left="1701" w:header="708" w:footer="708" w:gutter="0"/>
+      <w:cols w:space="708"/>
       <w:docGrid w:linePitch="360"/>
     </w:sectPr>
   </w:body>
 </w:document>
-</file>
-
-<file path=word/endnotes.xml><?xml version="1.0" encoding="utf-8"?>
-<w:endnotes xmlns:wpc="http://schemas.microsoft.com/office/word/2010/wordprocessingCanvas" xmlns:cx="http://schemas.microsoft.com/office/drawing/2014/chartex" xmlns:cx1="http://schemas.microsoft.com/office/drawing/2015/9/8/chartex" xmlns:cx2="http://schemas.microsoft.com/office/drawing/2015/10/21/chartex" xmlns:cx3="http://schemas.microsoft.com/office/drawing/2016/5/9/chartex" xmlns:cx4="http://schemas.microsoft.com/office/drawing/2016/5/10/chartex" xmlns:cx5="http://schemas.microsoft.com/office/drawing/2016/5/11/chartex" xmlns:cx6="http://schemas.microsoft.com/office/drawing/2016/5/12/chartex" xmlns:cx7="http://schemas.microsoft.com/office/drawing/2016/5/13/chartex" xmlns:cx8="http://schemas.microsoft.com/office/drawing/2016/5/14/chartex" xmlns:mc="http://schemas.openxmlformats.org/markup-compatibility/2006" xmlns:aink="http://schemas.microsoft.com/office/drawing/2016/ink" xmlns:am3d="http://schemas.microsoft.com/office/drawing/2017/model3d" xmlns:o="urn:schemas-microsoft-com:office:office" xmlns:oel="http://schemas.microsoft.com/office/2019/extlst" xmlns:r="http://schemas.openxmlformats.org/officeDocument/2006/relationships" xmlns:m="http://schemas.openxmlformats.org/officeDocument/2006/math" xmlns:v="urn:schemas-microsoft-com:vml" xmlns:wp14="http://schemas.microsoft.com/office/word/2010/wordprocessingDrawing" xmlns:wp="http://schemas.openxmlformats.org/drawingml/2006/wordprocessingDrawing" xmlns:w10="urn:schemas-microsoft-com:office:word" xmlns:w="http://schemas.openxmlformats.org/wordprocessingml/2006/main" xmlns:w14="http://schemas.microsoft.com/office/word/2010/wordml" xmlns:w15="http://schemas.microsoft.com/office/word/2012/wordml" xmlns:w16cex="http://schemas.microsoft.com/office/word/2018/wordml/cex" xmlns:w16cid="http://schemas.microsoft.com/office/word/2016/wordml/cid" xmlns:w16="http://schemas.microsoft.com/office/word/2018/wordml" xmlns:w16du="http://schemas.microsoft.com/office/word/2023/wordml/word16du" xmlns:w16sdtdh="http://schemas.microsoft.com/office/word/2020/wordml/sdtdatahash" xmlns:w16sdtfl="http://schemas.microsoft.com/office/word/2024/wordml/sdtformatlock" xmlns:w16se="http://schemas.microsoft.com/office/word/2015/wordml/symex" xmlns:wpg="http://schemas.microsoft.com/office/word/2010/wordprocessingGroup" xmlns:wpi="http://schemas.microsoft.com/office/word/2010/wordprocessingInk" xmlns:wne="http://schemas.microsoft.com/office/word/2006/wordml" xmlns:wps="http://schemas.microsoft.com/office/word/2010/wordprocessingShape" mc:Ignorable="w14 w15 w16se w16cid w16 w16cex w16sdtdh w16sdtfl w16du wp14">
-  <w:endnote w:type="separator" w:id="-1">
-    <w:p>
-      <w:r>
-        <w:separator/>
-      </w:r>
-    </w:p>
-  </w:endnote>
-  <w:endnote w:type="continuationSeparator" w:id="0">
-    <w:p>
-      <w:r>
-        <w:continuationSeparator/>
-      </w:r>
-    </w:p>
-  </w:endnote>
-</w:endnotes>
-</file>
-
-<file path=word/footer1.xml><?xml version="1.0" encoding="utf-8"?>
-<w:ftr xmlns:wpc="http://schemas.microsoft.com/office/word/2010/wordprocessingCanvas" xmlns:cx="http://schemas.microsoft.com/office/drawing/2014/chartex" xmlns:cx1="http://schemas.microsoft.com/office/drawing/2015/9/8/chartex" xmlns:cx2="http://schemas.microsoft.com/office/drawing/2015/10/21/chartex" xmlns:cx3="http://schemas.microsoft.com/office/drawing/2016/5/9/chartex" xmlns:cx4="http://schemas.microsoft.com/office/drawing/2016/5/10/chartex" xmlns:cx5="http://schemas.microsoft.com/office/drawing/2016/5/11/chartex" xmlns:cx6="http://schemas.microsoft.com/office/drawing/2016/5/12/chartex" xmlns:cx7="http://schemas.microsoft.com/office/drawing/2016/5/13/chartex" xmlns:cx8="http://schemas.microsoft.com/office/drawing/2016/5/14/chartex" xmlns:mc="http://schemas.openxmlformats.org/markup-compatibility/2006" xmlns:aink="http://schemas.microsoft.com/office/drawing/2016/ink" xmlns:am3d="http://schemas.microsoft.com/office/drawing/2017/model3d" xmlns:o="urn:schemas-microsoft-com:office:office" xmlns:oel="http://schemas.microsoft.com/office/2019/extlst" xmlns:r="http://schemas.openxmlformats.org/officeDocument/2006/relationships" xmlns:m="http://schemas.openxmlformats.org/officeDocument/2006/math" xmlns:v="urn:schemas-microsoft-com:vml" xmlns:wp14="http://schemas.microsoft.com/office/word/2010/wordprocessingDrawing" xmlns:wp="http://schemas.openxmlformats.org/drawingml/2006/wordprocessingDrawing" xmlns:w10="urn:schemas-microsoft-com:office:word" xmlns:w="http://schemas.openxmlformats.org/wordprocessingml/2006/main" xmlns:w14="http://schemas.microsoft.com/office/word/2010/wordml" xmlns:w15="http://schemas.microsoft.com/office/word/2012/wordml" xmlns:w16cex="http://schemas.microsoft.com/office/word/2018/wordml/cex" xmlns:w16cid="http://schemas.microsoft.com/office/word/2016/wordml/cid" xmlns:w16="http://schemas.microsoft.com/office/word/2018/wordml" xmlns:w16du="http://schemas.microsoft.com/office/word/2023/wordml/word16du" xmlns:w16sdtdh="http://schemas.microsoft.com/office/word/2020/wordml/sdtdatahash" xmlns:w16sdtfl="http://schemas.microsoft.com/office/word/2024/wordml/sdtformatlock" xmlns:w16se="http://schemas.microsoft.com/office/word/2015/wordml/symex" xmlns:wpg="http://schemas.microsoft.com/office/word/2010/wordprocessingGroup" xmlns:wpi="http://schemas.microsoft.com/office/word/2010/wordprocessingInk" xmlns:wne="http://schemas.microsoft.com/office/word/2006/wordml" xmlns:wps="http://schemas.microsoft.com/office/word/2010/wordprocessingShape" mc:Ignorable="w14 w15 w16se w16cid w16 w16cex w16sdtdh w16sdtfl w16du wp14">
-  <w:p>
-    <w:pPr>
-      <w:jc w:val="center"/>
-    </w:pPr>
-    <w:r>
-      <w:rPr>
-        <w:color w:val="595959"/>
-        <w:sz w:val="16"/>
-        <w:szCs w:val="16"/>
-      </w:rPr>
-      <w:t xml:space="preserve">Página </w:t>
-    </w:r>
-    <w:r>
-      <w:rPr>
-        <w:color w:val="595959"/>
-        <w:sz w:val="16"/>
-        <w:szCs w:val="16"/>
-      </w:rPr>
-      <w:fldChar w:fldCharType="begin"/>
-    </w:r>
-    <w:r>
-      <w:rPr>
-        <w:color w:val="595959"/>
-        <w:sz w:val="16"/>
-        <w:szCs w:val="16"/>
-      </w:rPr>
-      <w:instrText>PAGE</w:instrText>
-    </w:r>
-    <w:r>
-      <w:rPr>
-        <w:color w:val="595959"/>
-        <w:sz w:val="16"/>
-        <w:szCs w:val="16"/>
-      </w:rPr>
-      <w:fldChar w:fldCharType="separate"/>
-    </w:r>
-    <w:r>
-      <w:rPr>
-        <w:noProof/>
-        <w:color w:val="595959"/>
-        <w:sz w:val="16"/>
-        <w:szCs w:val="16"/>
-      </w:rPr>
-      <w:t>1</w:t>
-    </w:r>
-    <w:r>
-      <w:rPr>
-        <w:color w:val="595959"/>
-        <w:sz w:val="16"/>
-        <w:szCs w:val="16"/>
-      </w:rPr>
-      <w:fldChar w:fldCharType="end"/>
-    </w:r>
-    <w:r>
-      <w:rPr>
-        <w:color w:val="595959"/>
-        <w:sz w:val="16"/>
-        <w:szCs w:val="16"/>
-      </w:rPr>
-      <w:t xml:space="preserve"> de </w:t>
-    </w:r>
-    <w:r>
-      <w:rPr>
-        <w:color w:val="595959"/>
-        <w:sz w:val="16"/>
-        <w:szCs w:val="16"/>
-      </w:rPr>
-      <w:fldChar w:fldCharType="begin"/>
-    </w:r>
-    <w:r>
-      <w:rPr>
-        <w:color w:val="595959"/>
-        <w:sz w:val="16"/>
-        <w:szCs w:val="16"/>
-      </w:rPr>
-      <w:instrText>NUMPAGES</w:instrText>
-    </w:r>
-    <w:r>
-      <w:rPr>
-        <w:color w:val="595959"/>
-        <w:sz w:val="16"/>
-        <w:szCs w:val="16"/>
-      </w:rPr>
-      <w:fldChar w:fldCharType="separate"/>
-    </w:r>
-    <w:r>
-      <w:rPr>
-        <w:noProof/>
-        <w:color w:val="595959"/>
-        <w:sz w:val="16"/>
-        <w:szCs w:val="16"/>
-      </w:rPr>
-      <w:t>2</w:t>
-    </w:r>
-    <w:r>
-      <w:rPr>
-        <w:color w:val="595959"/>
-        <w:sz w:val="16"/>
-        <w:szCs w:val="16"/>
-      </w:rPr>
-      <w:fldChar w:fldCharType="end"/>
-    </w:r>
-  </w:p>
-</w:ftr>
-</file>
-
-<file path=word/footnotes.xml><?xml version="1.0" encoding="utf-8"?>
-<w:footnotes xmlns:wpc="http://schemas.microsoft.com/office/word/2010/wordprocessingCanvas" xmlns:cx="http://schemas.microsoft.com/office/drawing/2014/chartex" xmlns:cx1="http://schemas.microsoft.com/office/drawing/2015/9/8/chartex" xmlns:cx2="http://schemas.microsoft.com/office/drawing/2015/10/21/chartex" xmlns:cx3="http://schemas.microsoft.com/office/drawing/2016/5/9/chartex" xmlns:cx4="http://schemas.microsoft.com/office/drawing/2016/5/10/chartex" xmlns:cx5="http://schemas.microsoft.com/office/drawing/2016/5/11/chartex" xmlns:cx6="http://schemas.microsoft.com/office/drawing/2016/5/12/chartex" xmlns:cx7="http://schemas.microsoft.com/office/drawing/2016/5/13/chartex" xmlns:cx8="http://schemas.microsoft.com/office/drawing/2016/5/14/chartex" xmlns:mc="http://schemas.openxmlformats.org/markup-compatibility/2006" xmlns:aink="http://schemas.microsoft.com/office/drawing/2016/ink" xmlns:am3d="http://schemas.microsoft.com/office/drawing/2017/model3d" xmlns:o="urn:schemas-microsoft-com:office:office" xmlns:oel="http://schemas.microsoft.com/office/2019/extlst" xmlns:r="http://schemas.openxmlformats.org/officeDocument/2006/relationships" xmlns:m="http://schemas.openxmlformats.org/officeDocument/2006/math" xmlns:v="urn:schemas-microsoft-com:vml" xmlns:wp14="http://schemas.microsoft.com/office/word/2010/wordprocessingDrawing" xmlns:wp="http://schemas.openxmlformats.org/drawingml/2006/wordprocessingDrawing" xmlns:w10="urn:schemas-microsoft-com:office:word" xmlns:w="http://schemas.openxmlformats.org/wordprocessingml/2006/main" xmlns:w14="http://schemas.microsoft.com/office/word/2010/wordml" xmlns:w15="http://schemas.microsoft.com/office/word/2012/wordml" xmlns:w16cex="http://schemas.microsoft.com/office/word/2018/wordml/cex" xmlns:w16cid="http://schemas.microsoft.com/office/word/2016/wordml/cid" xmlns:w16="http://schemas.microsoft.com/office/word/2018/wordml" xmlns:w16du="http://schemas.microsoft.com/office/word/2023/wordml/word16du" xmlns:w16sdtdh="http://schemas.microsoft.com/office/word/2020/wordml/sdtdatahash" xmlns:w16sdtfl="http://schemas.microsoft.com/office/word/2024/wordml/sdtformatlock" xmlns:w16se="http://schemas.microsoft.com/office/word/2015/wordml/symex" xmlns:wpg="http://schemas.microsoft.com/office/word/2010/wordprocessingGroup" xmlns:wpi="http://schemas.microsoft.com/office/word/2010/wordprocessingInk" xmlns:wne="http://schemas.microsoft.com/office/word/2006/wordml" xmlns:wps="http://schemas.microsoft.com/office/word/2010/wordprocessingShape" mc:Ignorable="w14 w15 w16se w16cid w16 w16cex w16sdtdh w16sdtfl w16du wp14">
-  <w:footnote w:type="separator" w:id="-1">
-    <w:p>
-      <w:r>
-        <w:separator/>
-      </w:r>
-    </w:p>
-  </w:footnote>
-  <w:footnote w:type="continuationSeparator" w:id="0">
-    <w:p>
-      <w:r>
-        <w:continuationSeparator/>
-      </w:r>
-    </w:p>
-  </w:footnote>
-</w:footnotes>
-</file>
-
-<file path=word/header1.xml><?xml version="1.0" encoding="utf-8"?>
-<w:hdr xmlns:wpc="http://schemas.microsoft.com/office/word/2010/wordprocessingCanvas" xmlns:cx="http://schemas.microsoft.com/office/drawing/2014/chartex" xmlns:cx1="http://schemas.microsoft.com/office/drawing/2015/9/8/chartex" xmlns:cx2="http://schemas.microsoft.com/office/drawing/2015/10/21/chartex" xmlns:cx3="http://schemas.microsoft.com/office/drawing/2016/5/9/chartex" xmlns:cx4="http://schemas.microsoft.com/office/drawing/2016/5/10/chartex" xmlns:cx5="http://schemas.microsoft.com/office/drawing/2016/5/11/chartex" xmlns:cx6="http://schemas.microsoft.com/office/drawing/2016/5/12/chartex" xmlns:cx7="http://schemas.microsoft.com/office/drawing/2016/5/13/chartex" xmlns:cx8="http://schemas.microsoft.com/office/drawing/2016/5/14/chartex" xmlns:mc="http://schemas.openxmlformats.org/markup-compatibility/2006" xmlns:aink="http://schemas.microsoft.com/office/drawing/2016/ink" xmlns:am3d="http://schemas.microsoft.com/office/drawing/2017/model3d" xmlns:o="urn:schemas-microsoft-com:office:office" xmlns:oel="http://schemas.microsoft.com/office/2019/extlst" xmlns:r="http://schemas.openxmlformats.org/officeDocument/2006/relationships" xmlns:m="http://schemas.openxmlformats.org/officeDocument/2006/math" xmlns:v="urn:schemas-microsoft-com:vml" xmlns:wp14="http://schemas.microsoft.com/office/word/2010/wordprocessingDrawing" xmlns:wp="http://schemas.openxmlformats.org/drawingml/2006/wordprocessingDrawing" xmlns:w10="urn:schemas-microsoft-com:office:word" xmlns:w="http://schemas.openxmlformats.org/wordprocessingml/2006/main" xmlns:w14="http://schemas.microsoft.com/office/word/2010/wordml" xmlns:w15="http://schemas.microsoft.com/office/word/2012/wordml" xmlns:w16cex="http://schemas.microsoft.com/office/word/2018/wordml/cex" xmlns:w16cid="http://schemas.microsoft.com/office/word/2016/wordml/cid" xmlns:w16="http://schemas.microsoft.com/office/word/2018/wordml" xmlns:w16du="http://schemas.microsoft.com/office/word/2023/wordml/word16du" xmlns:w16sdtdh="http://schemas.microsoft.com/office/word/2020/wordml/sdtdatahash" xmlns:w16sdtfl="http://schemas.microsoft.com/office/word/2024/wordml/sdtformatlock" xmlns:w16se="http://schemas.microsoft.com/office/word/2015/wordml/symex" xmlns:wpg="http://schemas.microsoft.com/office/word/2010/wordprocessingGroup" xmlns:wpi="http://schemas.microsoft.com/office/word/2010/wordprocessingInk" xmlns:wne="http://schemas.microsoft.com/office/word/2006/wordml" xmlns:wps="http://schemas.microsoft.com/office/word/2010/wordprocessingShape" mc:Ignorable="w14 w15 w16se w16cid w16 w16cex w16sdtdh w16sdtfl w16du wp14">
-  <w:p>
-    <w:pPr>
-      <w:jc w:val="right"/>
-    </w:pPr>
-    <w:r>
-      <w:rPr>
-        <w:color w:val="595959"/>
-        <w:sz w:val="16"/>
-        <w:szCs w:val="16"/>
-      </w:rPr>
-      <w:t xml:space="preserve">GASTRA — </w:t>
-    </w:r>
-    <w:proofErr w:type="spellStart"/>
-    <w:r>
-      <w:rPr>
-        <w:color w:val="595959"/>
-        <w:sz w:val="16"/>
-        <w:szCs w:val="16"/>
-      </w:rPr>
-      <w:t>User</w:t>
-    </w:r>
-    <w:proofErr w:type="spellEnd"/>
-    <w:r>
-      <w:rPr>
-        <w:color w:val="595959"/>
-        <w:sz w:val="16"/>
-        <w:szCs w:val="16"/>
-      </w:rPr>
-      <w:t xml:space="preserve"> Stories</w:t>
-    </w:r>
-  </w:p>
-</w:hdr>
-</file>
-
-<file path=word/numbering.xml><?xml version="1.0" encoding="utf-8"?>
-<w:numbering xmlns:wpc="http://schemas.microsoft.com/office/word/2010/wordprocessingCanvas" xmlns:cx="http://schemas.microsoft.com/office/drawing/2014/chartex" xmlns:cx1="http://schemas.microsoft.com/office/drawing/2015/9/8/chartex" xmlns:cx2="http://schemas.microsoft.com/office/drawing/2015/10/21/chartex" xmlns:cx3="http://schemas.microsoft.com/office/drawing/2016/5/9/chartex" xmlns:cx4="http://schemas.microsoft.com/office/drawing/2016/5/10/chartex" xmlns:cx5="http://schemas.microsoft.com/office/drawing/2016/5/11/chartex" xmlns:cx6="http://schemas.microsoft.com/office/drawing/2016/5/12/chartex" xmlns:cx7="http://schemas.microsoft.com/office/drawing/2016/5/13/chartex" xmlns:cx8="http://schemas.microsoft.com/office/drawing/2016/5/14/chartex" xmlns:mc="http://schemas.openxmlformats.org/markup-compatibility/2006" xmlns:aink="http://schemas.microsoft.com/office/drawing/2016/ink" xmlns:am3d="http://schemas.microsoft.com/office/drawing/2017/model3d" xmlns:o="urn:schemas-microsoft-com:office:office" xmlns:oel="http://schemas.microsoft.com/office/2019/extlst" xmlns:r="http://schemas.openxmlformats.org/officeDocument/2006/relationships" xmlns:m="http://schemas.openxmlformats.org/officeDocument/2006/math" xmlns:v="urn:schemas-microsoft-com:vml" xmlns:wp14="http://schemas.microsoft.com/office/word/2010/wordprocessingDrawing" xmlns:wp="http://schemas.openxmlformats.org/drawingml/2006/wordprocessingDrawing" xmlns:w10="urn:schemas-microsoft-com:office:word" xmlns:w="http://schemas.openxmlformats.org/wordprocessingml/2006/main" xmlns:w14="http://schemas.microsoft.com/office/word/2010/wordml" xmlns:w15="http://schemas.microsoft.com/office/word/2012/wordml" xmlns:w16cex="http://schemas.microsoft.com/office/word/2018/wordml/cex" xmlns:w16cid="http://schemas.microsoft.com/office/word/2016/wordml/cid" xmlns:w16="http://schemas.microsoft.com/office/word/2018/wordml" xmlns:w16du="http://schemas.microsoft.com/office/word/2023/wordml/word16du" xmlns:w16sdtdh="http://schemas.microsoft.com/office/word/2020/wordml/sdtdatahash" xmlns:w16sdtfl="http://schemas.microsoft.com/office/word/2024/wordml/sdtformatlock" xmlns:w16se="http://schemas.microsoft.com/office/word/2015/wordml/symex" xmlns:wpg="http://schemas.microsoft.com/office/word/2010/wordprocessingGroup" xmlns:wpi="http://schemas.microsoft.com/office/word/2010/wordprocessingInk" xmlns:wne="http://schemas.microsoft.com/office/word/2006/wordml" xmlns:wps="http://schemas.microsoft.com/office/word/2010/wordprocessingShape" mc:Ignorable="w14 w15 w16se w16cid w16 w16cex w16sdtdh w16sdtfl w16du wp14">
-  <w:abstractNum w:abstractNumId="0" w15:restartNumberingAfterBreak="0">
-    <w:nsid w:val="26665CA3"/>
-    <w:multiLevelType w:val="hybridMultilevel"/>
-    <w:tmpl w:val="9800B1B8"/>
-    <w:lvl w:ilvl="0" w:tplc="8E526F4C">
-      <w:start w:val="1"/>
-      <w:numFmt w:val="bullet"/>
-      <w:lvlText w:val="●"/>
-      <w:lvlJc w:val="left"/>
-      <w:pPr>
-        <w:ind w:left="720" w:hanging="360"/>
-      </w:pPr>
-    </w:lvl>
-    <w:lvl w:ilvl="1" w:tplc="2D36C336">
-      <w:start w:val="1"/>
-      <w:numFmt w:val="bullet"/>
-      <w:lvlText w:val="○"/>
-      <w:lvlJc w:val="left"/>
-      <w:pPr>
-        <w:ind w:left="1440" w:hanging="360"/>
-      </w:pPr>
-    </w:lvl>
-    <w:lvl w:ilvl="2" w:tplc="86E0BE56">
-      <w:start w:val="1"/>
-      <w:numFmt w:val="bullet"/>
-      <w:lvlText w:val="■"/>
-      <w:lvlJc w:val="left"/>
-      <w:pPr>
-        <w:ind w:left="2160" w:hanging="360"/>
-      </w:pPr>
-    </w:lvl>
-    <w:lvl w:ilvl="3" w:tplc="8E168A58">
-      <w:start w:val="1"/>
-      <w:numFmt w:val="bullet"/>
-      <w:lvlText w:val="●"/>
-      <w:lvlJc w:val="left"/>
-      <w:pPr>
-        <w:ind w:left="2880" w:hanging="360"/>
-      </w:pPr>
-    </w:lvl>
-    <w:lvl w:ilvl="4" w:tplc="BC8CDB12">
-      <w:start w:val="1"/>
-      <w:numFmt w:val="bullet"/>
-      <w:lvlText w:val="○"/>
-      <w:lvlJc w:val="left"/>
-      <w:pPr>
-        <w:ind w:left="3600" w:hanging="360"/>
-      </w:pPr>
-    </w:lvl>
-    <w:lvl w:ilvl="5" w:tplc="DFFC6A0A">
-      <w:start w:val="1"/>
-      <w:numFmt w:val="bullet"/>
-      <w:lvlText w:val="■"/>
-      <w:lvlJc w:val="left"/>
-      <w:pPr>
-        <w:ind w:left="4320" w:hanging="360"/>
-      </w:pPr>
-    </w:lvl>
-    <w:lvl w:ilvl="6" w:tplc="7B90AF2E">
-      <w:start w:val="1"/>
-      <w:numFmt w:val="bullet"/>
-      <w:lvlText w:val="●"/>
-      <w:lvlJc w:val="left"/>
-      <w:pPr>
-        <w:ind w:left="5040" w:hanging="360"/>
-      </w:pPr>
-    </w:lvl>
-    <w:lvl w:ilvl="7" w:tplc="EC1A2716">
-      <w:start w:val="1"/>
-      <w:numFmt w:val="bullet"/>
-      <w:lvlText w:val="●"/>
-      <w:lvlJc w:val="left"/>
-      <w:pPr>
-        <w:ind w:left="5760" w:hanging="360"/>
-      </w:pPr>
-    </w:lvl>
-    <w:lvl w:ilvl="8" w:tplc="E3C8EABE">
-      <w:start w:val="1"/>
-      <w:numFmt w:val="bullet"/>
-      <w:lvlText w:val="●"/>
-      <w:lvlJc w:val="left"/>
-      <w:pPr>
-        <w:ind w:left="6480" w:hanging="360"/>
-      </w:pPr>
-    </w:lvl>
-  </w:abstractNum>
-  <w:num w:numId="1" w16cid:durableId="536091577">
-    <w:abstractNumId w:val="0"/>
-    <w:lvlOverride w:ilvl="0">
-      <w:startOverride w:val="1"/>
-    </w:lvlOverride>
-  </w:num>
-</w:numbering>
 </file>
 
 <file path=word/styles.xml><?xml version="1.0" encoding="utf-8"?>
@@ -1592,13 +1165,19 @@
   <w:docDefaults>
     <w:rPrDefault>
       <w:rPr>
-        <w:rFonts w:ascii="Calibri" w:eastAsia="Calibri" w:hAnsi="Calibri" w:cs="Calibri"/>
-        <w:sz w:val="21"/>
-        <w:szCs w:val="21"/>
-        <w:lang w:val="pt-BR" w:eastAsia="pt-BR" w:bidi="ar-SA"/>
+        <w:rFonts w:asciiTheme="minorHAnsi" w:eastAsiaTheme="minorHAnsi" w:hAnsiTheme="minorHAnsi" w:cstheme="minorBidi"/>
+        <w:kern w:val="2"/>
+        <w:sz w:val="24"/>
+        <w:szCs w:val="24"/>
+        <w:lang w:val="pt-BR" w:eastAsia="en-US" w:bidi="ar-SA"/>
+        <w14:ligatures w14:val="standardContextual"/>
       </w:rPr>
     </w:rPrDefault>
-    <w:pPrDefault/>
+    <w:pPrDefault>
+      <w:pPr>
+        <w:spacing w:after="160" w:line="278" w:lineRule="auto"/>
+      </w:pPr>
+    </w:pPrDefault>
   </w:docDefaults>
   <w:latentStyles w:defLockedState="0" w:defUIPriority="99" w:defSemiHidden="0" w:defUnhideWhenUsed="0" w:defQFormat="0" w:count="376">
     <w:lsdException w:name="Normal" w:uiPriority="0" w:qFormat="1"/>
@@ -1981,92 +1560,255 @@
   <w:style w:type="paragraph" w:default="1" w:styleId="Normal">
     <w:name w:val="Normal"/>
     <w:qFormat/>
+    <w:rsid w:val="00AB07F3"/>
+    <w:pPr>
+      <w:spacing w:after="0" w:line="240" w:lineRule="auto"/>
+    </w:pPr>
+    <w:rPr>
+      <w:rFonts w:ascii="Times New Roman" w:eastAsia="Times New Roman" w:hAnsi="Times New Roman" w:cs="Times New Roman"/>
+      <w:kern w:val="0"/>
+      <w:sz w:val="20"/>
+      <w:szCs w:val="20"/>
+      <w:lang w:eastAsia="pt-BR"/>
+      <w14:ligatures w14:val="none"/>
+    </w:rPr>
   </w:style>
   <w:style w:type="paragraph" w:styleId="Ttulo1">
     <w:name w:val="heading 1"/>
+    <w:basedOn w:val="Normal"/>
+    <w:next w:val="Normal"/>
+    <w:link w:val="Ttulo1Char"/>
     <w:uiPriority w:val="9"/>
     <w:qFormat/>
+    <w:rsid w:val="00AB07F3"/>
     <w:pPr>
-      <w:spacing w:before="320" w:after="160"/>
+      <w:keepNext/>
+      <w:keepLines/>
+      <w:spacing w:before="360" w:after="80" w:line="278" w:lineRule="auto"/>
       <w:outlineLvl w:val="0"/>
     </w:pPr>
     <w:rPr>
-      <w:b/>
-      <w:bCs/>
-      <w:color w:val="1F3864"/>
-      <w:sz w:val="30"/>
-      <w:szCs w:val="30"/>
+      <w:rFonts w:asciiTheme="majorHAnsi" w:eastAsiaTheme="majorEastAsia" w:hAnsiTheme="majorHAnsi" w:cstheme="majorBidi"/>
+      <w:color w:val="0F4761" w:themeColor="accent1" w:themeShade="BF"/>
+      <w:kern w:val="2"/>
+      <w:sz w:val="40"/>
+      <w:szCs w:val="40"/>
+      <w:lang w:eastAsia="en-US"/>
+      <w14:ligatures w14:val="standardContextual"/>
     </w:rPr>
   </w:style>
   <w:style w:type="paragraph" w:styleId="Ttulo2">
     <w:name w:val="heading 2"/>
+    <w:basedOn w:val="Normal"/>
+    <w:next w:val="Normal"/>
+    <w:link w:val="Ttulo2Char"/>
     <w:uiPriority w:val="9"/>
     <w:semiHidden/>
     <w:unhideWhenUsed/>
     <w:qFormat/>
+    <w:rsid w:val="00AB07F3"/>
     <w:pPr>
+      <w:keepNext/>
+      <w:keepLines/>
+      <w:spacing w:before="160" w:after="80" w:line="278" w:lineRule="auto"/>
       <w:outlineLvl w:val="1"/>
     </w:pPr>
     <w:rPr>
-      <w:color w:val="2E74B5"/>
-      <w:sz w:val="26"/>
-      <w:szCs w:val="26"/>
+      <w:rFonts w:asciiTheme="majorHAnsi" w:eastAsiaTheme="majorEastAsia" w:hAnsiTheme="majorHAnsi" w:cstheme="majorBidi"/>
+      <w:color w:val="0F4761" w:themeColor="accent1" w:themeShade="BF"/>
+      <w:kern w:val="2"/>
+      <w:sz w:val="32"/>
+      <w:szCs w:val="32"/>
+      <w:lang w:eastAsia="en-US"/>
+      <w14:ligatures w14:val="standardContextual"/>
     </w:rPr>
   </w:style>
   <w:style w:type="paragraph" w:styleId="Ttulo3">
     <w:name w:val="heading 3"/>
+    <w:basedOn w:val="Normal"/>
+    <w:next w:val="Normal"/>
+    <w:link w:val="Ttulo3Char"/>
     <w:uiPriority w:val="9"/>
     <w:semiHidden/>
     <w:unhideWhenUsed/>
     <w:qFormat/>
+    <w:rsid w:val="00AB07F3"/>
     <w:pPr>
+      <w:keepNext/>
+      <w:keepLines/>
+      <w:spacing w:before="160" w:after="80" w:line="278" w:lineRule="auto"/>
       <w:outlineLvl w:val="2"/>
     </w:pPr>
     <w:rPr>
-      <w:color w:val="1F4D78"/>
-      <w:sz w:val="24"/>
-      <w:szCs w:val="24"/>
+      <w:rFonts w:asciiTheme="minorHAnsi" w:eastAsiaTheme="majorEastAsia" w:hAnsiTheme="minorHAnsi" w:cstheme="majorBidi"/>
+      <w:color w:val="0F4761" w:themeColor="accent1" w:themeShade="BF"/>
+      <w:kern w:val="2"/>
+      <w:sz w:val="28"/>
+      <w:szCs w:val="28"/>
+      <w:lang w:eastAsia="en-US"/>
+      <w14:ligatures w14:val="standardContextual"/>
     </w:rPr>
   </w:style>
   <w:style w:type="paragraph" w:styleId="Ttulo4">
     <w:name w:val="heading 4"/>
+    <w:basedOn w:val="Normal"/>
+    <w:next w:val="Normal"/>
+    <w:link w:val="Ttulo4Char"/>
     <w:uiPriority w:val="9"/>
     <w:semiHidden/>
     <w:unhideWhenUsed/>
     <w:qFormat/>
+    <w:rsid w:val="00AB07F3"/>
     <w:pPr>
+      <w:keepNext/>
+      <w:keepLines/>
+      <w:spacing w:before="80" w:after="40" w:line="278" w:lineRule="auto"/>
       <w:outlineLvl w:val="3"/>
     </w:pPr>
     <w:rPr>
+      <w:rFonts w:asciiTheme="minorHAnsi" w:eastAsiaTheme="majorEastAsia" w:hAnsiTheme="minorHAnsi" w:cstheme="majorBidi"/>
       <w:i/>
       <w:iCs/>
-      <w:color w:val="2E74B5"/>
+      <w:color w:val="0F4761" w:themeColor="accent1" w:themeShade="BF"/>
+      <w:kern w:val="2"/>
+      <w:sz w:val="24"/>
+      <w:szCs w:val="24"/>
+      <w:lang w:eastAsia="en-US"/>
+      <w14:ligatures w14:val="standardContextual"/>
     </w:rPr>
   </w:style>
   <w:style w:type="paragraph" w:styleId="Ttulo5">
     <w:name w:val="heading 5"/>
+    <w:basedOn w:val="Normal"/>
+    <w:next w:val="Normal"/>
+    <w:link w:val="Ttulo5Char"/>
     <w:uiPriority w:val="9"/>
     <w:semiHidden/>
     <w:unhideWhenUsed/>
     <w:qFormat/>
+    <w:rsid w:val="00AB07F3"/>
     <w:pPr>
+      <w:keepNext/>
+      <w:keepLines/>
+      <w:spacing w:before="80" w:after="40" w:line="278" w:lineRule="auto"/>
       <w:outlineLvl w:val="4"/>
     </w:pPr>
     <w:rPr>
-      <w:color w:val="2E74B5"/>
+      <w:rFonts w:asciiTheme="minorHAnsi" w:eastAsiaTheme="majorEastAsia" w:hAnsiTheme="minorHAnsi" w:cstheme="majorBidi"/>
+      <w:color w:val="0F4761" w:themeColor="accent1" w:themeShade="BF"/>
+      <w:kern w:val="2"/>
+      <w:sz w:val="24"/>
+      <w:szCs w:val="24"/>
+      <w:lang w:eastAsia="en-US"/>
+      <w14:ligatures w14:val="standardContextual"/>
     </w:rPr>
   </w:style>
   <w:style w:type="paragraph" w:styleId="Ttulo6">
     <w:name w:val="heading 6"/>
+    <w:basedOn w:val="Normal"/>
+    <w:next w:val="Normal"/>
+    <w:link w:val="Ttulo6Char"/>
     <w:uiPriority w:val="9"/>
     <w:semiHidden/>
     <w:unhideWhenUsed/>
     <w:qFormat/>
+    <w:rsid w:val="00AB07F3"/>
     <w:pPr>
+      <w:keepNext/>
+      <w:keepLines/>
+      <w:spacing w:before="40" w:line="278" w:lineRule="auto"/>
       <w:outlineLvl w:val="5"/>
     </w:pPr>
     <w:rPr>
-      <w:color w:val="1F4D78"/>
+      <w:rFonts w:asciiTheme="minorHAnsi" w:eastAsiaTheme="majorEastAsia" w:hAnsiTheme="minorHAnsi" w:cstheme="majorBidi"/>
+      <w:i/>
+      <w:iCs/>
+      <w:color w:val="595959" w:themeColor="text1" w:themeTint="A6"/>
+      <w:kern w:val="2"/>
+      <w:sz w:val="24"/>
+      <w:szCs w:val="24"/>
+      <w:lang w:eastAsia="en-US"/>
+      <w14:ligatures w14:val="standardContextual"/>
+    </w:rPr>
+  </w:style>
+  <w:style w:type="paragraph" w:styleId="Ttulo7">
+    <w:name w:val="heading 7"/>
+    <w:basedOn w:val="Normal"/>
+    <w:next w:val="Normal"/>
+    <w:link w:val="Ttulo7Char"/>
+    <w:uiPriority w:val="9"/>
+    <w:semiHidden/>
+    <w:unhideWhenUsed/>
+    <w:qFormat/>
+    <w:rsid w:val="00AB07F3"/>
+    <w:pPr>
+      <w:keepNext/>
+      <w:keepLines/>
+      <w:spacing w:before="40" w:line="278" w:lineRule="auto"/>
+      <w:outlineLvl w:val="6"/>
+    </w:pPr>
+    <w:rPr>
+      <w:rFonts w:asciiTheme="minorHAnsi" w:eastAsiaTheme="majorEastAsia" w:hAnsiTheme="minorHAnsi" w:cstheme="majorBidi"/>
+      <w:color w:val="595959" w:themeColor="text1" w:themeTint="A6"/>
+      <w:kern w:val="2"/>
+      <w:sz w:val="24"/>
+      <w:szCs w:val="24"/>
+      <w:lang w:eastAsia="en-US"/>
+      <w14:ligatures w14:val="standardContextual"/>
+    </w:rPr>
+  </w:style>
+  <w:style w:type="paragraph" w:styleId="Ttulo8">
+    <w:name w:val="heading 8"/>
+    <w:basedOn w:val="Normal"/>
+    <w:next w:val="Normal"/>
+    <w:link w:val="Ttulo8Char"/>
+    <w:uiPriority w:val="9"/>
+    <w:semiHidden/>
+    <w:unhideWhenUsed/>
+    <w:qFormat/>
+    <w:rsid w:val="00AB07F3"/>
+    <w:pPr>
+      <w:keepNext/>
+      <w:keepLines/>
+      <w:spacing w:line="278" w:lineRule="auto"/>
+      <w:outlineLvl w:val="7"/>
+    </w:pPr>
+    <w:rPr>
+      <w:rFonts w:asciiTheme="minorHAnsi" w:eastAsiaTheme="majorEastAsia" w:hAnsiTheme="minorHAnsi" w:cstheme="majorBidi"/>
+      <w:i/>
+      <w:iCs/>
+      <w:color w:val="272727" w:themeColor="text1" w:themeTint="D8"/>
+      <w:kern w:val="2"/>
+      <w:sz w:val="24"/>
+      <w:szCs w:val="24"/>
+      <w:lang w:eastAsia="en-US"/>
+      <w14:ligatures w14:val="standardContextual"/>
+    </w:rPr>
+  </w:style>
+  <w:style w:type="paragraph" w:styleId="Ttulo9">
+    <w:name w:val="heading 9"/>
+    <w:basedOn w:val="Normal"/>
+    <w:next w:val="Normal"/>
+    <w:link w:val="Ttulo9Char"/>
+    <w:uiPriority w:val="9"/>
+    <w:semiHidden/>
+    <w:unhideWhenUsed/>
+    <w:qFormat/>
+    <w:rsid w:val="00AB07F3"/>
+    <w:pPr>
+      <w:keepNext/>
+      <w:keepLines/>
+      <w:spacing w:line="278" w:lineRule="auto"/>
+      <w:outlineLvl w:val="8"/>
+    </w:pPr>
+    <w:rPr>
+      <w:rFonts w:asciiTheme="minorHAnsi" w:eastAsiaTheme="majorEastAsia" w:hAnsiTheme="minorHAnsi" w:cstheme="majorBidi"/>
+      <w:color w:val="272727" w:themeColor="text1" w:themeTint="D8"/>
+      <w:kern w:val="2"/>
+      <w:sz w:val="24"/>
+      <w:szCs w:val="24"/>
+      <w:lang w:eastAsia="en-US"/>
+      <w14:ligatures w14:val="standardContextual"/>
     </w:rPr>
   </w:style>
   <w:style w:type="character" w:default="1" w:styleId="Fontepargpadro">
@@ -2096,96 +1838,321 @@
     <w:semiHidden/>
     <w:unhideWhenUsed/>
   </w:style>
+  <w:style w:type="character" w:customStyle="1" w:styleId="Ttulo1Char">
+    <w:name w:val="Título 1 Char"/>
+    <w:basedOn w:val="Fontepargpadro"/>
+    <w:link w:val="Ttulo1"/>
+    <w:uiPriority w:val="9"/>
+    <w:rsid w:val="00AB07F3"/>
+    <w:rPr>
+      <w:rFonts w:asciiTheme="majorHAnsi" w:eastAsiaTheme="majorEastAsia" w:hAnsiTheme="majorHAnsi" w:cstheme="majorBidi"/>
+      <w:color w:val="0F4761" w:themeColor="accent1" w:themeShade="BF"/>
+      <w:sz w:val="40"/>
+      <w:szCs w:val="40"/>
+    </w:rPr>
+  </w:style>
+  <w:style w:type="character" w:customStyle="1" w:styleId="Ttulo2Char">
+    <w:name w:val="Título 2 Char"/>
+    <w:basedOn w:val="Fontepargpadro"/>
+    <w:link w:val="Ttulo2"/>
+    <w:uiPriority w:val="9"/>
+    <w:semiHidden/>
+    <w:rsid w:val="00AB07F3"/>
+    <w:rPr>
+      <w:rFonts w:asciiTheme="majorHAnsi" w:eastAsiaTheme="majorEastAsia" w:hAnsiTheme="majorHAnsi" w:cstheme="majorBidi"/>
+      <w:color w:val="0F4761" w:themeColor="accent1" w:themeShade="BF"/>
+      <w:sz w:val="32"/>
+      <w:szCs w:val="32"/>
+    </w:rPr>
+  </w:style>
+  <w:style w:type="character" w:customStyle="1" w:styleId="Ttulo3Char">
+    <w:name w:val="Título 3 Char"/>
+    <w:basedOn w:val="Fontepargpadro"/>
+    <w:link w:val="Ttulo3"/>
+    <w:uiPriority w:val="9"/>
+    <w:semiHidden/>
+    <w:rsid w:val="00AB07F3"/>
+    <w:rPr>
+      <w:rFonts w:eastAsiaTheme="majorEastAsia" w:cstheme="majorBidi"/>
+      <w:color w:val="0F4761" w:themeColor="accent1" w:themeShade="BF"/>
+      <w:sz w:val="28"/>
+      <w:szCs w:val="28"/>
+    </w:rPr>
+  </w:style>
+  <w:style w:type="character" w:customStyle="1" w:styleId="Ttulo4Char">
+    <w:name w:val="Título 4 Char"/>
+    <w:basedOn w:val="Fontepargpadro"/>
+    <w:link w:val="Ttulo4"/>
+    <w:uiPriority w:val="9"/>
+    <w:semiHidden/>
+    <w:rsid w:val="00AB07F3"/>
+    <w:rPr>
+      <w:rFonts w:eastAsiaTheme="majorEastAsia" w:cstheme="majorBidi"/>
+      <w:i/>
+      <w:iCs/>
+      <w:color w:val="0F4761" w:themeColor="accent1" w:themeShade="BF"/>
+    </w:rPr>
+  </w:style>
+  <w:style w:type="character" w:customStyle="1" w:styleId="Ttulo5Char">
+    <w:name w:val="Título 5 Char"/>
+    <w:basedOn w:val="Fontepargpadro"/>
+    <w:link w:val="Ttulo5"/>
+    <w:uiPriority w:val="9"/>
+    <w:semiHidden/>
+    <w:rsid w:val="00AB07F3"/>
+    <w:rPr>
+      <w:rFonts w:eastAsiaTheme="majorEastAsia" w:cstheme="majorBidi"/>
+      <w:color w:val="0F4761" w:themeColor="accent1" w:themeShade="BF"/>
+    </w:rPr>
+  </w:style>
+  <w:style w:type="character" w:customStyle="1" w:styleId="Ttulo6Char">
+    <w:name w:val="Título 6 Char"/>
+    <w:basedOn w:val="Fontepargpadro"/>
+    <w:link w:val="Ttulo6"/>
+    <w:uiPriority w:val="9"/>
+    <w:semiHidden/>
+    <w:rsid w:val="00AB07F3"/>
+    <w:rPr>
+      <w:rFonts w:eastAsiaTheme="majorEastAsia" w:cstheme="majorBidi"/>
+      <w:i/>
+      <w:iCs/>
+      <w:color w:val="595959" w:themeColor="text1" w:themeTint="A6"/>
+    </w:rPr>
+  </w:style>
+  <w:style w:type="character" w:customStyle="1" w:styleId="Ttulo7Char">
+    <w:name w:val="Título 7 Char"/>
+    <w:basedOn w:val="Fontepargpadro"/>
+    <w:link w:val="Ttulo7"/>
+    <w:uiPriority w:val="9"/>
+    <w:semiHidden/>
+    <w:rsid w:val="00AB07F3"/>
+    <w:rPr>
+      <w:rFonts w:eastAsiaTheme="majorEastAsia" w:cstheme="majorBidi"/>
+      <w:color w:val="595959" w:themeColor="text1" w:themeTint="A6"/>
+    </w:rPr>
+  </w:style>
+  <w:style w:type="character" w:customStyle="1" w:styleId="Ttulo8Char">
+    <w:name w:val="Título 8 Char"/>
+    <w:basedOn w:val="Fontepargpadro"/>
+    <w:link w:val="Ttulo8"/>
+    <w:uiPriority w:val="9"/>
+    <w:semiHidden/>
+    <w:rsid w:val="00AB07F3"/>
+    <w:rPr>
+      <w:rFonts w:eastAsiaTheme="majorEastAsia" w:cstheme="majorBidi"/>
+      <w:i/>
+      <w:iCs/>
+      <w:color w:val="272727" w:themeColor="text1" w:themeTint="D8"/>
+    </w:rPr>
+  </w:style>
+  <w:style w:type="character" w:customStyle="1" w:styleId="Ttulo9Char">
+    <w:name w:val="Título 9 Char"/>
+    <w:basedOn w:val="Fontepargpadro"/>
+    <w:link w:val="Ttulo9"/>
+    <w:uiPriority w:val="9"/>
+    <w:semiHidden/>
+    <w:rsid w:val="00AB07F3"/>
+    <w:rPr>
+      <w:rFonts w:eastAsiaTheme="majorEastAsia" w:cstheme="majorBidi"/>
+      <w:color w:val="272727" w:themeColor="text1" w:themeTint="D8"/>
+    </w:rPr>
+  </w:style>
   <w:style w:type="paragraph" w:styleId="Ttulo">
     <w:name w:val="Title"/>
+    <w:basedOn w:val="Normal"/>
+    <w:next w:val="Normal"/>
+    <w:link w:val="TtuloChar"/>
     <w:uiPriority w:val="10"/>
     <w:qFormat/>
-    <w:rPr>
+    <w:rsid w:val="00AB07F3"/>
+    <w:pPr>
+      <w:spacing w:after="80"/>
+      <w:contextualSpacing/>
+    </w:pPr>
+    <w:rPr>
+      <w:rFonts w:asciiTheme="majorHAnsi" w:eastAsiaTheme="majorEastAsia" w:hAnsiTheme="majorHAnsi" w:cstheme="majorBidi"/>
+      <w:spacing w:val="-10"/>
+      <w:kern w:val="28"/>
       <w:sz w:val="56"/>
       <w:szCs w:val="56"/>
-    </w:rPr>
-  </w:style>
-  <w:style w:type="paragraph" w:customStyle="1" w:styleId="Forte1">
-    <w:name w:val="Forte1"/>
+      <w:lang w:eastAsia="en-US"/>
+      <w14:ligatures w14:val="standardContextual"/>
+    </w:rPr>
+  </w:style>
+  <w:style w:type="character" w:customStyle="1" w:styleId="TtuloChar">
+    <w:name w:val="Título Char"/>
+    <w:basedOn w:val="Fontepargpadro"/>
+    <w:link w:val="Ttulo"/>
+    <w:uiPriority w:val="10"/>
+    <w:rsid w:val="00AB07F3"/>
+    <w:rPr>
+      <w:rFonts w:asciiTheme="majorHAnsi" w:eastAsiaTheme="majorEastAsia" w:hAnsiTheme="majorHAnsi" w:cstheme="majorBidi"/>
+      <w:spacing w:val="-10"/>
+      <w:kern w:val="28"/>
+      <w:sz w:val="56"/>
+      <w:szCs w:val="56"/>
+    </w:rPr>
+  </w:style>
+  <w:style w:type="paragraph" w:styleId="Subttulo">
+    <w:name w:val="Subtitle"/>
+    <w:basedOn w:val="Normal"/>
+    <w:next w:val="Normal"/>
+    <w:link w:val="SubttuloChar"/>
+    <w:uiPriority w:val="11"/>
     <w:qFormat/>
+    <w:rsid w:val="00AB07F3"/>
+    <w:pPr>
+      <w:numPr>
+        <w:ilvl w:val="1"/>
+      </w:numPr>
+      <w:spacing w:after="160" w:line="278" w:lineRule="auto"/>
+    </w:pPr>
+    <w:rPr>
+      <w:rFonts w:asciiTheme="minorHAnsi" w:eastAsiaTheme="majorEastAsia" w:hAnsiTheme="minorHAnsi" w:cstheme="majorBidi"/>
+      <w:color w:val="595959" w:themeColor="text1" w:themeTint="A6"/>
+      <w:spacing w:val="15"/>
+      <w:kern w:val="2"/>
+      <w:sz w:val="28"/>
+      <w:szCs w:val="28"/>
+      <w:lang w:eastAsia="en-US"/>
+      <w14:ligatures w14:val="standardContextual"/>
+    </w:rPr>
+  </w:style>
+  <w:style w:type="character" w:customStyle="1" w:styleId="SubttuloChar">
+    <w:name w:val="Subtítulo Char"/>
+    <w:basedOn w:val="Fontepargpadro"/>
+    <w:link w:val="Subttulo"/>
+    <w:uiPriority w:val="11"/>
+    <w:rsid w:val="00AB07F3"/>
+    <w:rPr>
+      <w:rFonts w:eastAsiaTheme="majorEastAsia" w:cstheme="majorBidi"/>
+      <w:color w:val="595959" w:themeColor="text1" w:themeTint="A6"/>
+      <w:spacing w:val="15"/>
+      <w:sz w:val="28"/>
+      <w:szCs w:val="28"/>
+    </w:rPr>
+  </w:style>
+  <w:style w:type="paragraph" w:styleId="Citao">
+    <w:name w:val="Quote"/>
+    <w:basedOn w:val="Normal"/>
+    <w:next w:val="Normal"/>
+    <w:link w:val="CitaoChar"/>
+    <w:uiPriority w:val="29"/>
+    <w:qFormat/>
+    <w:rsid w:val="00AB07F3"/>
+    <w:pPr>
+      <w:spacing w:before="160" w:after="160" w:line="278" w:lineRule="auto"/>
+      <w:jc w:val="center"/>
+    </w:pPr>
+    <w:rPr>
+      <w:rFonts w:asciiTheme="minorHAnsi" w:eastAsiaTheme="minorHAnsi" w:hAnsiTheme="minorHAnsi" w:cstheme="minorBidi"/>
+      <w:i/>
+      <w:iCs/>
+      <w:color w:val="404040" w:themeColor="text1" w:themeTint="BF"/>
+      <w:kern w:val="2"/>
+      <w:sz w:val="24"/>
+      <w:szCs w:val="24"/>
+      <w:lang w:eastAsia="en-US"/>
+      <w14:ligatures w14:val="standardContextual"/>
+    </w:rPr>
+  </w:style>
+  <w:style w:type="character" w:customStyle="1" w:styleId="CitaoChar">
+    <w:name w:val="Citação Char"/>
+    <w:basedOn w:val="Fontepargpadro"/>
+    <w:link w:val="Citao"/>
+    <w:uiPriority w:val="29"/>
+    <w:rsid w:val="00AB07F3"/>
+    <w:rPr>
+      <w:i/>
+      <w:iCs/>
+      <w:color w:val="404040" w:themeColor="text1" w:themeTint="BF"/>
+    </w:rPr>
+  </w:style>
+  <w:style w:type="paragraph" w:styleId="PargrafodaLista">
+    <w:name w:val="List Paragraph"/>
+    <w:basedOn w:val="Normal"/>
+    <w:uiPriority w:val="34"/>
+    <w:qFormat/>
+    <w:rsid w:val="00AB07F3"/>
+    <w:pPr>
+      <w:spacing w:after="160" w:line="278" w:lineRule="auto"/>
+      <w:ind w:left="720"/>
+      <w:contextualSpacing/>
+    </w:pPr>
+    <w:rPr>
+      <w:rFonts w:asciiTheme="minorHAnsi" w:eastAsiaTheme="minorHAnsi" w:hAnsiTheme="minorHAnsi" w:cstheme="minorBidi"/>
+      <w:kern w:val="2"/>
+      <w:sz w:val="24"/>
+      <w:szCs w:val="24"/>
+      <w:lang w:eastAsia="en-US"/>
+      <w14:ligatures w14:val="standardContextual"/>
+    </w:rPr>
+  </w:style>
+  <w:style w:type="character" w:styleId="nfaseIntensa">
+    <w:name w:val="Intense Emphasis"/>
+    <w:basedOn w:val="Fontepargpadro"/>
+    <w:uiPriority w:val="21"/>
+    <w:qFormat/>
+    <w:rsid w:val="00AB07F3"/>
+    <w:rPr>
+      <w:i/>
+      <w:iCs/>
+      <w:color w:val="0F4761" w:themeColor="accent1" w:themeShade="BF"/>
+    </w:rPr>
+  </w:style>
+  <w:style w:type="paragraph" w:styleId="CitaoIntensa">
+    <w:name w:val="Intense Quote"/>
+    <w:basedOn w:val="Normal"/>
+    <w:next w:val="Normal"/>
+    <w:link w:val="CitaoIntensaChar"/>
+    <w:uiPriority w:val="30"/>
+    <w:qFormat/>
+    <w:rsid w:val="00AB07F3"/>
+    <w:pPr>
+      <w:pBdr>
+        <w:top w:val="single" w:sz="4" w:space="10" w:color="0F4761" w:themeColor="accent1" w:themeShade="BF"/>
+        <w:bottom w:val="single" w:sz="4" w:space="10" w:color="0F4761" w:themeColor="accent1" w:themeShade="BF"/>
+      </w:pBdr>
+      <w:spacing w:before="360" w:after="360" w:line="278" w:lineRule="auto"/>
+      <w:ind w:left="864" w:right="864"/>
+      <w:jc w:val="center"/>
+    </w:pPr>
+    <w:rPr>
+      <w:rFonts w:asciiTheme="minorHAnsi" w:eastAsiaTheme="minorHAnsi" w:hAnsiTheme="minorHAnsi" w:cstheme="minorBidi"/>
+      <w:i/>
+      <w:iCs/>
+      <w:color w:val="0F4761" w:themeColor="accent1" w:themeShade="BF"/>
+      <w:kern w:val="2"/>
+      <w:sz w:val="24"/>
+      <w:szCs w:val="24"/>
+      <w:lang w:eastAsia="en-US"/>
+      <w14:ligatures w14:val="standardContextual"/>
+    </w:rPr>
+  </w:style>
+  <w:style w:type="character" w:customStyle="1" w:styleId="CitaoIntensaChar">
+    <w:name w:val="Citação Intensa Char"/>
+    <w:basedOn w:val="Fontepargpadro"/>
+    <w:link w:val="CitaoIntensa"/>
+    <w:uiPriority w:val="30"/>
+    <w:rsid w:val="00AB07F3"/>
+    <w:rPr>
+      <w:i/>
+      <w:iCs/>
+      <w:color w:val="0F4761" w:themeColor="accent1" w:themeShade="BF"/>
+    </w:rPr>
+  </w:style>
+  <w:style w:type="character" w:styleId="RefernciaIntensa">
+    <w:name w:val="Intense Reference"/>
+    <w:basedOn w:val="Fontepargpadro"/>
+    <w:uiPriority w:val="32"/>
+    <w:qFormat/>
+    <w:rsid w:val="00AB07F3"/>
     <w:rPr>
       <w:b/>
       <w:bCs/>
-    </w:rPr>
-  </w:style>
-  <w:style w:type="paragraph" w:styleId="PargrafodaLista">
-    <w:name w:val="List Paragraph"/>
-    <w:qFormat/>
-  </w:style>
-  <w:style w:type="character" w:styleId="Hyperlink">
-    <w:name w:val="Hyperlink"/>
-    <w:uiPriority w:val="99"/>
-    <w:unhideWhenUsed/>
-    <w:rPr>
-      <w:color w:val="0563C1"/>
-      <w:u w:val="single"/>
-    </w:rPr>
-  </w:style>
-  <w:style w:type="character" w:styleId="Refdenotaderodap">
-    <w:name w:val="footnote reference"/>
-    <w:uiPriority w:val="99"/>
-    <w:semiHidden/>
-    <w:unhideWhenUsed/>
-    <w:rPr>
-      <w:vertAlign w:val="superscript"/>
-    </w:rPr>
-  </w:style>
-  <w:style w:type="paragraph" w:styleId="Textodenotaderodap">
-    <w:name w:val="footnote text"/>
-    <w:link w:val="TextodenotaderodapChar"/>
-    <w:uiPriority w:val="99"/>
-    <w:semiHidden/>
-    <w:unhideWhenUsed/>
-    <w:rPr>
-      <w:sz w:val="20"/>
-      <w:szCs w:val="20"/>
-    </w:rPr>
-  </w:style>
-  <w:style w:type="character" w:customStyle="1" w:styleId="TextodenotaderodapChar">
-    <w:name w:val="Texto de nota de rodapé Char"/>
-    <w:link w:val="Textodenotaderodap"/>
-    <w:uiPriority w:val="99"/>
-    <w:semiHidden/>
-    <w:unhideWhenUsed/>
-    <w:rPr>
-      <w:sz w:val="20"/>
-      <w:szCs w:val="20"/>
-    </w:rPr>
-  </w:style>
-  <w:style w:type="character" w:styleId="Refdenotadefim">
-    <w:name w:val="endnote reference"/>
-    <w:uiPriority w:val="99"/>
-    <w:semiHidden/>
-    <w:unhideWhenUsed/>
-    <w:rPr>
-      <w:vertAlign w:val="superscript"/>
-    </w:rPr>
-  </w:style>
-  <w:style w:type="paragraph" w:styleId="Textodenotadefim">
-    <w:name w:val="endnote text"/>
-    <w:link w:val="TextodenotadefimChar"/>
-    <w:uiPriority w:val="99"/>
-    <w:semiHidden/>
-    <w:unhideWhenUsed/>
-    <w:rPr>
-      <w:sz w:val="20"/>
-      <w:szCs w:val="20"/>
-    </w:rPr>
-  </w:style>
-  <w:style w:type="character" w:customStyle="1" w:styleId="TextodenotadefimChar">
-    <w:name w:val="Texto de nota de fim Char"/>
-    <w:link w:val="Textodenotadefim"/>
-    <w:uiPriority w:val="99"/>
-    <w:semiHidden/>
-    <w:unhideWhenUsed/>
-    <w:rPr>
-      <w:sz w:val="20"/>
-      <w:szCs w:val="20"/>
+      <w:smallCaps/>
+      <w:color w:val="0F4761" w:themeColor="accent1" w:themeShade="BF"/>
+      <w:spacing w:val="5"/>
     </w:rPr>
   </w:style>
 </w:styles>

</xml_diff>